<commit_message>
26-06-23, Winnie the Poeh bijgewerkt
</commit_message>
<xml_diff>
--- a/BlogsWord/DeGrote Gemeenschap.docx
+++ b/BlogsWord/DeGrote Gemeenschap.docx
@@ -174,7 +174,23 @@
           <w:sz w:val="22"/>
           <w:szCs w:val="22"/>
         </w:rPr>
-        <w:t xml:space="preserve">figuren uit de kinderliteratuur. </w:t>
+        <w:t xml:space="preserve">figuren uit de </w:t>
+      </w:r>
+      <w:r>
+        <w:rPr>
+          <w:rFonts w:ascii="Courier New" w:hAnsi="Courier New" w:cs="Courier New"/>
+          <w:sz w:val="22"/>
+          <w:szCs w:val="22"/>
+        </w:rPr>
+        <w:t>wereld</w:t>
+      </w:r>
+      <w:r>
+        <w:rPr>
+          <w:rFonts w:ascii="Courier New" w:hAnsi="Courier New" w:cs="Courier New"/>
+          <w:sz w:val="22"/>
+          <w:szCs w:val="22"/>
+        </w:rPr>
+        <w:t xml:space="preserve">kinderliteratuur. </w:t>
       </w:r>
       <w:r>
         <w:rPr>
@@ -419,7 +435,23 @@
           <w:sz w:val="22"/>
           <w:szCs w:val="22"/>
         </w:rPr>
-        <w:t xml:space="preserve"> is Christopher Robin</w:t>
+        <w:t xml:space="preserve"> is </w:t>
+      </w:r>
+      <w:r>
+        <w:rPr>
+          <w:rFonts w:ascii="Courier New" w:hAnsi="Courier New" w:cs="Courier New"/>
+          <w:sz w:val="22"/>
+          <w:szCs w:val="22"/>
+        </w:rPr>
+        <w:t xml:space="preserve">het </w:t>
+      </w:r>
+      <w:r>
+        <w:rPr>
+          <w:rFonts w:ascii="Courier New" w:hAnsi="Courier New" w:cs="Courier New"/>
+          <w:sz w:val="22"/>
+          <w:szCs w:val="22"/>
+        </w:rPr>
+        <w:t>Christopher Robin</w:t>
       </w:r>
       <w:r>
         <w:rPr>
@@ -467,23 +499,23 @@
           <w:sz w:val="22"/>
           <w:szCs w:val="22"/>
         </w:rPr>
-        <w:t>H</w:t>
-      </w:r>
-      <w:r>
-        <w:rPr>
-          <w:rFonts w:ascii="Courier New" w:hAnsi="Courier New" w:cs="Courier New"/>
-          <w:sz w:val="22"/>
-          <w:szCs w:val="22"/>
-        </w:rPr>
-        <w:t xml:space="preserve">et verhaal </w:t>
-      </w:r>
-      <w:r>
-        <w:rPr>
-          <w:rFonts w:ascii="Courier New" w:hAnsi="Courier New" w:cs="Courier New"/>
-          <w:sz w:val="22"/>
-          <w:szCs w:val="22"/>
-        </w:rPr>
-        <w:t>zelf zoekt</w:t>
+        <w:t xml:space="preserve">De verhalen </w:t>
+      </w:r>
+      <w:r>
+        <w:rPr>
+          <w:rFonts w:ascii="Courier New" w:hAnsi="Courier New" w:cs="Courier New"/>
+          <w:sz w:val="22"/>
+          <w:szCs w:val="22"/>
+        </w:rPr>
+        <w:t>zelf zoek</w:t>
+      </w:r>
+      <w:r>
+        <w:rPr>
+          <w:rFonts w:ascii="Courier New" w:hAnsi="Courier New" w:cs="Courier New"/>
+          <w:sz w:val="22"/>
+          <w:szCs w:val="22"/>
+        </w:rPr>
+        <w:t>en</w:t>
       </w:r>
       <w:r>
         <w:rPr>
@@ -523,15 +555,79 @@
           <w:sz w:val="22"/>
           <w:szCs w:val="22"/>
         </w:rPr>
-        <w:t xml:space="preserve"> weet dat het om speelgoed gaat dat tot leven komt in de verbeelding van een kind, maar binnen het verhaal zijn de dieren volwaardige personen met hun eigen karakter, zorgen en verlangens.</w:t>
-      </w:r>
-      <w:r>
-        <w:rPr>
-          <w:rFonts w:ascii="Courier New" w:hAnsi="Courier New" w:cs="Courier New"/>
-          <w:sz w:val="22"/>
-          <w:szCs w:val="22"/>
-        </w:rPr>
-        <w:t xml:space="preserve"> Maar om welke personen gaat het?</w:t>
+        <w:t xml:space="preserve"> weet dat het om </w:t>
+      </w:r>
+      <w:r>
+        <w:rPr>
+          <w:rFonts w:ascii="Courier New" w:hAnsi="Courier New" w:cs="Courier New"/>
+          <w:sz w:val="22"/>
+          <w:szCs w:val="22"/>
+        </w:rPr>
+        <w:t xml:space="preserve">poppen en </w:t>
+      </w:r>
+      <w:r>
+        <w:rPr>
+          <w:rFonts w:ascii="Courier New" w:hAnsi="Courier New" w:cs="Courier New"/>
+          <w:sz w:val="22"/>
+          <w:szCs w:val="22"/>
+        </w:rPr>
+        <w:t>speelgoed gaat dat tot leven komt in de verbeelding van een kind</w:t>
+      </w:r>
+      <w:r>
+        <w:rPr>
+          <w:rFonts w:ascii="Courier New" w:hAnsi="Courier New" w:cs="Courier New"/>
+          <w:sz w:val="22"/>
+          <w:szCs w:val="22"/>
+        </w:rPr>
+        <w:t>. Binnen de verhalen in het Honderd Bunderbos</w:t>
+      </w:r>
+      <w:r>
+        <w:rPr>
+          <w:rFonts w:ascii="Courier New" w:hAnsi="Courier New" w:cs="Courier New"/>
+          <w:sz w:val="22"/>
+          <w:szCs w:val="22"/>
+        </w:rPr>
+        <w:t xml:space="preserve"> zijn de dieren volwaardige personen met hun eigen karakter, zorgen en verlangens.</w:t>
+      </w:r>
+      <w:r>
+        <w:rPr>
+          <w:rFonts w:ascii="Courier New" w:hAnsi="Courier New" w:cs="Courier New"/>
+          <w:sz w:val="22"/>
+          <w:szCs w:val="22"/>
+        </w:rPr>
+        <w:t xml:space="preserve"> </w:t>
+      </w:r>
+      <w:r>
+        <w:rPr>
+          <w:rFonts w:ascii="Courier New" w:hAnsi="Courier New" w:cs="Courier New"/>
+          <w:sz w:val="22"/>
+          <w:szCs w:val="22"/>
+        </w:rPr>
+        <w:t>Wie zijn het en waar</w:t>
+      </w:r>
+      <w:r>
+        <w:rPr>
+          <w:rFonts w:ascii="Courier New" w:hAnsi="Courier New" w:cs="Courier New"/>
+          <w:sz w:val="22"/>
+          <w:szCs w:val="22"/>
+        </w:rPr>
+        <w:t xml:space="preserve"> gaat het</w:t>
+      </w:r>
+      <w:r>
+        <w:rPr>
+          <w:rFonts w:ascii="Courier New" w:hAnsi="Courier New" w:cs="Courier New"/>
+          <w:sz w:val="22"/>
+          <w:szCs w:val="22"/>
+        </w:rPr>
+        <w:t xml:space="preserve"> over</w:t>
+      </w:r>
+      <w:r>
+        <w:rPr>
+          <w:rFonts w:ascii="Courier New" w:hAnsi="Courier New" w:cs="Courier New"/>
+          <w:sz w:val="22"/>
+          <w:szCs w:val="22"/>
+        </w:rPr>
+        <w:t>?</w:t>
       </w:r>
     </w:p>
     <w:p>
@@ -691,7 +787,15 @@
           <w:sz w:val="22"/>
           <w:szCs w:val="22"/>
         </w:rPr>
-        <w:t>, maar hij is wel</w:t>
+        <w:t>. H</w:t>
+      </w:r>
+      <w:r>
+        <w:rPr>
+          <w:rFonts w:ascii="Courier New" w:hAnsi="Courier New" w:cs="Courier New"/>
+          <w:sz w:val="22"/>
+          <w:szCs w:val="22"/>
+        </w:rPr>
+        <w:t>ij is wel</w:t>
       </w:r>
       <w:r>
         <w:rPr>
@@ -835,7 +939,7 @@
           <w:sz w:val="22"/>
           <w:szCs w:val="22"/>
         </w:rPr>
-        <w:t xml:space="preserve">Hij </w:t>
+        <w:t xml:space="preserve">Hij kent </w:t>
       </w:r>
       <w:r>
         <w:rPr>
@@ -844,7 +948,7 @@
           <w:szCs w:val="22"/>
         </w:rPr>
         <w:lastRenderedPageBreak/>
-        <w:t>kent een zwakke kant</w:t>
+        <w:t>een zwakke kant</w:t>
       </w:r>
       <w:r>
         <w:rPr>
@@ -918,13 +1022,11 @@
           <w:sz w:val="22"/>
           <w:szCs w:val="22"/>
         </w:rPr>
-        <w:t>Toen dacht hij opnieuw een hele poos na en zei:</w:t>
-      </w:r>
-      <w:r>
-        <w:rPr>
-          <w:rFonts w:ascii="Courier New" w:hAnsi="Courier New" w:cs="Courier New"/>
-          <w:i/>
-          <w:iCs/>
+        <w:t>Toen dacht hij opnieuw een hele poos na en zei: ‘En de enige reden waarom een bij bestaat, voor zover ik weet, is het maken van honing.’ Toen stond hij op en zei: ‘En de enige reden om honing te maken is zodat ik hem kan opeten.’ Daarop begon hij in de boom te klimmen.”</w:t>
+      </w:r>
+      <w:r>
+        <w:rPr>
+          <w:rFonts w:ascii="Courier New" w:hAnsi="Courier New" w:cs="Courier New"/>
           <w:sz w:val="22"/>
           <w:szCs w:val="22"/>
         </w:rPr>
@@ -933,94 +1035,6 @@
       <w:r>
         <w:rPr>
           <w:rFonts w:ascii="Courier New" w:hAnsi="Courier New" w:cs="Courier New"/>
-          <w:i/>
-          <w:iCs/>
-          <w:sz w:val="22"/>
-          <w:szCs w:val="22"/>
-        </w:rPr>
-        <w:t>‘En de enige reden waarom een bij bestaat, voor zover ik weet, is het maken van honing.’</w:t>
-      </w:r>
-      <w:r>
-        <w:rPr>
-          <w:rFonts w:ascii="Courier New" w:hAnsi="Courier New" w:cs="Courier New"/>
-          <w:i/>
-          <w:iCs/>
-          <w:sz w:val="22"/>
-          <w:szCs w:val="22"/>
-        </w:rPr>
-        <w:t xml:space="preserve"> </w:t>
-      </w:r>
-      <w:r>
-        <w:rPr>
-          <w:rFonts w:ascii="Courier New" w:hAnsi="Courier New" w:cs="Courier New"/>
-          <w:i/>
-          <w:iCs/>
-          <w:sz w:val="22"/>
-          <w:szCs w:val="22"/>
-        </w:rPr>
-        <w:t>Toen stond hij op en zei:</w:t>
-      </w:r>
-      <w:r>
-        <w:rPr>
-          <w:rFonts w:ascii="Courier New" w:hAnsi="Courier New" w:cs="Courier New"/>
-          <w:i/>
-          <w:iCs/>
-          <w:sz w:val="22"/>
-          <w:szCs w:val="22"/>
-        </w:rPr>
-        <w:t xml:space="preserve"> </w:t>
-      </w:r>
-      <w:r>
-        <w:rPr>
-          <w:rFonts w:ascii="Courier New" w:hAnsi="Courier New" w:cs="Courier New"/>
-          <w:i/>
-          <w:iCs/>
-          <w:sz w:val="22"/>
-          <w:szCs w:val="22"/>
-        </w:rPr>
-        <w:t>‘En de enige reden om honing te maken is zodat ik hem kan opeten.’</w:t>
-      </w:r>
-      <w:r>
-        <w:rPr>
-          <w:rFonts w:ascii="Courier New" w:hAnsi="Courier New" w:cs="Courier New"/>
-          <w:i/>
-          <w:iCs/>
-          <w:sz w:val="22"/>
-          <w:szCs w:val="22"/>
-        </w:rPr>
-        <w:t xml:space="preserve"> </w:t>
-      </w:r>
-      <w:r>
-        <w:rPr>
-          <w:rFonts w:ascii="Courier New" w:hAnsi="Courier New" w:cs="Courier New"/>
-          <w:i/>
-          <w:iCs/>
-          <w:sz w:val="22"/>
-          <w:szCs w:val="22"/>
-        </w:rPr>
-        <w:t>Daarop begon hij in de boom te klimmen.</w:t>
-      </w:r>
-      <w:r>
-        <w:rPr>
-          <w:rFonts w:ascii="Courier New" w:hAnsi="Courier New" w:cs="Courier New"/>
-          <w:i/>
-          <w:iCs/>
-          <w:sz w:val="22"/>
-          <w:szCs w:val="22"/>
-        </w:rPr>
-        <w:t>”</w:t>
-      </w:r>
-      <w:r>
-        <w:rPr>
-          <w:rFonts w:ascii="Courier New" w:hAnsi="Courier New" w:cs="Courier New"/>
-          <w:sz w:val="22"/>
-          <w:szCs w:val="22"/>
-        </w:rPr>
-        <w:t xml:space="preserve"> </w:t>
-      </w:r>
-      <w:r>
-        <w:rPr>
-          <w:rFonts w:ascii="Courier New" w:hAnsi="Courier New" w:cs="Courier New"/>
           <w:sz w:val="22"/>
           <w:szCs w:val="22"/>
         </w:rPr>
@@ -1128,7 +1142,7 @@
           <w:sz w:val="22"/>
           <w:szCs w:val="22"/>
         </w:rPr>
-        <w:t xml:space="preserve"> idee uitvoert, maakt het verhaal zo humoristisch.</w:t>
+        <w:t xml:space="preserve"> idee uitvoert, maakt het verhaal humoristisch.</w:t>
       </w:r>
     </w:p>
     <w:p>
@@ -1163,7 +1177,55 @@
           <w:sz w:val="22"/>
           <w:szCs w:val="22"/>
         </w:rPr>
-        <w:t xml:space="preserve"> misverstanden, vergissingen en de botsing tussen kinderlijke logica en de werkelijkheid</w:t>
+        <w:t xml:space="preserve"> misverstanden</w:t>
+      </w:r>
+      <w:r>
+        <w:rPr>
+          <w:rFonts w:ascii="Courier New" w:hAnsi="Courier New" w:cs="Courier New"/>
+          <w:sz w:val="22"/>
+          <w:szCs w:val="22"/>
+        </w:rPr>
+        <w:t xml:space="preserve"> en</w:t>
+      </w:r>
+      <w:r>
+        <w:rPr>
+          <w:rFonts w:ascii="Courier New" w:hAnsi="Courier New" w:cs="Courier New"/>
+          <w:sz w:val="22"/>
+          <w:szCs w:val="22"/>
+        </w:rPr>
+        <w:t xml:space="preserve"> vergissingen en </w:t>
+      </w:r>
+      <w:r>
+        <w:rPr>
+          <w:rFonts w:ascii="Courier New" w:hAnsi="Courier New" w:cs="Courier New"/>
+          <w:sz w:val="22"/>
+          <w:szCs w:val="22"/>
+        </w:rPr>
+        <w:t xml:space="preserve">laten </w:t>
+      </w:r>
+      <w:r>
+        <w:rPr>
+          <w:rFonts w:ascii="Courier New" w:hAnsi="Courier New" w:cs="Courier New"/>
+          <w:sz w:val="22"/>
+          <w:szCs w:val="22"/>
+        </w:rPr>
+        <w:t xml:space="preserve">de botsing </w:t>
+      </w:r>
+      <w:r>
+        <w:rPr>
+          <w:rFonts w:ascii="Courier New" w:hAnsi="Courier New" w:cs="Courier New"/>
+          <w:sz w:val="22"/>
+          <w:szCs w:val="22"/>
+        </w:rPr>
+        <w:t xml:space="preserve">zien </w:t>
+      </w:r>
+      <w:r>
+        <w:rPr>
+          <w:rFonts w:ascii="Courier New" w:hAnsi="Courier New" w:cs="Courier New"/>
+          <w:sz w:val="22"/>
+          <w:szCs w:val="22"/>
+        </w:rPr>
+        <w:t>tussen kinderlijke logica en de werkelijkheid</w:t>
       </w:r>
       <w:r>
         <w:rPr>
@@ -1179,23 +1241,7 @@
           <w:sz w:val="22"/>
           <w:szCs w:val="22"/>
         </w:rPr>
-        <w:t xml:space="preserve">Poeh op bezoek gaat bij Konijn. Nadat hij zich </w:t>
-      </w:r>
-      <w:r>
-        <w:rPr>
-          <w:rFonts w:ascii="Courier New" w:hAnsi="Courier New" w:cs="Courier New"/>
-          <w:sz w:val="22"/>
-          <w:szCs w:val="22"/>
-        </w:rPr>
-        <w:t xml:space="preserve">er </w:t>
-      </w:r>
-      <w:r>
-        <w:rPr>
-          <w:rFonts w:ascii="Courier New" w:hAnsi="Courier New" w:cs="Courier New"/>
-          <w:sz w:val="22"/>
-          <w:szCs w:val="22"/>
-        </w:rPr>
-        <w:t xml:space="preserve">te goed heeft gedaan aan honing en andere lekkernijen, blijkt hij zo dik geworden dat hij vast komt te zitten in de voordeur van zijn gastheer. </w:t>
+        <w:t xml:space="preserve">Poeh op bezoek gaat bij Konijn. Nadat hij zich te goed heeft gedaan aan honing en andere lekkernijen, blijkt hij zo dik geworden dat hij vast komt te zitten in de voordeur van zijn gastheer. </w:t>
       </w:r>
       <w:r>
         <w:rPr>
@@ -1205,77 +1251,7 @@
           <w:sz w:val="22"/>
           <w:szCs w:val="22"/>
         </w:rPr>
-        <w:t>“</w:t>
-      </w:r>
-      <w:r>
-        <w:rPr>
-          <w:rFonts w:ascii="Courier New" w:hAnsi="Courier New" w:cs="Courier New"/>
-          <w:i/>
-          <w:iCs/>
-          <w:sz w:val="22"/>
-          <w:szCs w:val="22"/>
-        </w:rPr>
-        <w:t>Poeh Beer stak een poot naar buiten en Konijn trok en trok en trok...‘Au!’ riep Poeh. ‘Je doet me zeer!’</w:t>
-      </w:r>
-      <w:r>
-        <w:rPr>
-          <w:rFonts w:ascii="Courier New" w:hAnsi="Courier New" w:cs="Courier New"/>
-          <w:i/>
-          <w:iCs/>
-          <w:sz w:val="22"/>
-          <w:szCs w:val="22"/>
-        </w:rPr>
-        <w:t xml:space="preserve"> </w:t>
-      </w:r>
-      <w:r>
-        <w:rPr>
-          <w:rFonts w:ascii="Courier New" w:hAnsi="Courier New" w:cs="Courier New"/>
-          <w:i/>
-          <w:iCs/>
-          <w:sz w:val="22"/>
-          <w:szCs w:val="22"/>
-        </w:rPr>
-        <w:t>‘Het punt is,’ zei Konijn, ‘dat je klem zit.’</w:t>
-      </w:r>
-      <w:r>
-        <w:rPr>
-          <w:rFonts w:ascii="Courier New" w:hAnsi="Courier New" w:cs="Courier New"/>
-          <w:i/>
-          <w:iCs/>
-          <w:sz w:val="22"/>
-          <w:szCs w:val="22"/>
-        </w:rPr>
-        <w:t xml:space="preserve"> </w:t>
-      </w:r>
-      <w:r>
-        <w:rPr>
-          <w:rFonts w:ascii="Courier New" w:hAnsi="Courier New" w:cs="Courier New"/>
-          <w:i/>
-          <w:iCs/>
-          <w:sz w:val="22"/>
-          <w:szCs w:val="22"/>
-        </w:rPr>
-        <w:t>‘Dat komt er nou van,’ zei Poeh geërgerd, ‘als voordeuren niet groot genoeg zijn.’</w:t>
-      </w:r>
-      <w:r>
-        <w:rPr>
-          <w:rFonts w:ascii="Courier New" w:hAnsi="Courier New" w:cs="Courier New"/>
-          <w:i/>
-          <w:iCs/>
-          <w:sz w:val="22"/>
-          <w:szCs w:val="22"/>
-        </w:rPr>
-        <w:t xml:space="preserve"> </w:t>
-      </w:r>
-      <w:r>
-        <w:rPr>
-          <w:rFonts w:ascii="Courier New" w:hAnsi="Courier New" w:cs="Courier New"/>
-          <w:i/>
-          <w:iCs/>
-          <w:sz w:val="22"/>
-          <w:szCs w:val="22"/>
-        </w:rPr>
-        <w:t>‘Dat komt er nou van,’ zei Konijn streng, ‘als je te veel eet. Ik dacht het toen al,’ zei Konijn, ‘maar ik wilde er niets van zeggen,’ zei Konijn, ‘dat...’</w:t>
+        <w:t>“Poeh Beer stak een poot naar buiten en Konijn trok en trok en trok...‘Au!’ riep Poeh. ‘Je doet me zeer!’ ‘Het punt is,’ zei Konijn, ‘dat je klem zit.’ ‘Dat komt er nou van,’ zei Poeh geërgerd, ‘als voordeuren niet groot genoeg zijn.’ ‘Dat komt er nou van,’ zei Konijn streng, ‘als je te veel eet. Ik dacht het toen al,’ zei Konijn, ‘maar ik wilde er niets van zeggen,’ zei Konijn, ‘dat...’</w:t>
       </w:r>
       <w:r>
         <w:rPr>
@@ -1368,7 +1344,23 @@
           <w:sz w:val="22"/>
           <w:szCs w:val="22"/>
         </w:rPr>
-        <w:t xml:space="preserve">. Hij is klein, onzeker en vaak bang. Toch blijkt hij telkens weer over onverwachte moed te beschikken wanneer zijn vrienden hem nodig hebben. Samen beleven zij avonturen die vaak beginnen met een eenvoudig idee en monden </w:t>
+        <w:t xml:space="preserve">. Hij is klein, onzeker en vaak bang. Toch blijkt hij telkens weer over onverwachte moed te beschikken wanneer zijn vrienden hem nodig hebben. Samen beleven </w:t>
+      </w:r>
+      <w:r>
+        <w:rPr>
+          <w:rFonts w:ascii="Courier New" w:hAnsi="Courier New" w:cs="Courier New"/>
+          <w:sz w:val="22"/>
+          <w:szCs w:val="22"/>
+        </w:rPr>
+        <w:t>Poen en Knorretje</w:t>
+      </w:r>
+      <w:r>
+        <w:rPr>
+          <w:rFonts w:ascii="Courier New" w:hAnsi="Courier New" w:cs="Courier New"/>
+          <w:sz w:val="22"/>
+          <w:szCs w:val="22"/>
+        </w:rPr>
+        <w:t xml:space="preserve"> avonturen die vaak beginnen met een eenvoudig idee en monden </w:t>
       </w:r>
       <w:r>
         <w:rPr>
@@ -1384,7 +1376,39 @@
           <w:sz w:val="22"/>
           <w:szCs w:val="22"/>
         </w:rPr>
-        <w:t>in verwarring of ontdekking. Wanneer zij bijvoorbeeld sporen in de sneeuw volgen, raken zij ervan overtuigd dat zij een gevaarlijk wezen op het spoor zijn. Pas later beseffen zij dat zij al die tijd hun eigen voetstappen hebben gevolgd. Het verhaal laat niet alleen zien hoe gemakkelijk verbeelding werkelijkheid kan lijken, maar ook hoe vriendschap angst draaglijk maakt.</w:t>
+        <w:t xml:space="preserve">in verwarring of ontdekking. Wanneer zij bijvoorbeeld sporen in de sneeuw volgen, raken zij ervan overtuigd dat zij een gevaarlijk wezen op het spoor zijn. Pas later beseffen zij dat zij al die tijd hun eigen voetstappen hebben gevolgd. Het verhaal laat niet alleen zien hoe gemakkelijk verbeelding </w:t>
+      </w:r>
+      <w:r>
+        <w:rPr>
+          <w:rFonts w:ascii="Courier New" w:hAnsi="Courier New" w:cs="Courier New"/>
+          <w:sz w:val="22"/>
+          <w:szCs w:val="22"/>
+        </w:rPr>
+        <w:t xml:space="preserve">op </w:t>
+      </w:r>
+      <w:r>
+        <w:rPr>
+          <w:rFonts w:ascii="Courier New" w:hAnsi="Courier New" w:cs="Courier New"/>
+          <w:sz w:val="22"/>
+          <w:szCs w:val="22"/>
+        </w:rPr>
+        <w:t xml:space="preserve">werkelijkheid </w:t>
+      </w:r>
+      <w:r>
+        <w:rPr>
+          <w:rFonts w:ascii="Courier New" w:hAnsi="Courier New" w:cs="Courier New"/>
+          <w:sz w:val="22"/>
+          <w:szCs w:val="22"/>
+        </w:rPr>
+        <w:t>lijkt</w:t>
+      </w:r>
+      <w:r>
+        <w:rPr>
+          <w:rFonts w:ascii="Courier New" w:hAnsi="Courier New" w:cs="Courier New"/>
+          <w:sz w:val="22"/>
+          <w:szCs w:val="22"/>
+        </w:rPr>
+        <w:t>, maar ook hoe vriendschap angst draaglijk maakt.</w:t>
       </w:r>
     </w:p>
     <w:p>
@@ -1404,15 +1428,63 @@
           <w:szCs w:val="22"/>
         </w:rPr>
         <w:lastRenderedPageBreak/>
-        <w:t xml:space="preserve">Een van de meest geliefde figuren is Iejoor, de sombere ezel. Hij verwacht altijd het ergste en ziet in elke gebeurtenis een reden tot pessimisme. Toch wordt hij door niemand afgewezen. Zijn vrienden accepteren hem precies zoals hij is. Dat blijkt vooral uit het verhaal over zijn verjaardag. Poeh wil hem een pot honing geven, maar eet onderweg de inhoud op. Knorretje heeft een mooie ballon gekocht, maar laat die per ongeluk knappen. Uiteindelijk krijgt Iejoor een lege honingpot en een kapotte ballon. </w:t>
-      </w:r>
-      <w:r>
-        <w:rPr>
-          <w:rFonts w:ascii="Courier New" w:hAnsi="Courier New" w:cs="Courier New"/>
-          <w:sz w:val="22"/>
-          <w:szCs w:val="22"/>
-        </w:rPr>
-        <w:t xml:space="preserve">Maar uiteindelijk ziet dat hij, heel handig, een pot krijgt waar hij dingen in kan stoppen en uit kan halen. </w:t>
+        <w:t xml:space="preserve">Een </w:t>
+      </w:r>
+      <w:r>
+        <w:rPr>
+          <w:rFonts w:ascii="Courier New" w:hAnsi="Courier New" w:cs="Courier New"/>
+          <w:sz w:val="22"/>
+          <w:szCs w:val="22"/>
+        </w:rPr>
+        <w:t xml:space="preserve">ander </w:t>
+      </w:r>
+      <w:r>
+        <w:rPr>
+          <w:rFonts w:ascii="Courier New" w:hAnsi="Courier New" w:cs="Courier New"/>
+          <w:sz w:val="22"/>
+          <w:szCs w:val="22"/>
+        </w:rPr>
+        <w:t>geliefd figu</w:t>
+      </w:r>
+      <w:r>
+        <w:rPr>
+          <w:rFonts w:ascii="Courier New" w:hAnsi="Courier New" w:cs="Courier New"/>
+          <w:sz w:val="22"/>
+          <w:szCs w:val="22"/>
+        </w:rPr>
+        <w:t>ur</w:t>
+      </w:r>
+      <w:r>
+        <w:rPr>
+          <w:rFonts w:ascii="Courier New" w:hAnsi="Courier New" w:cs="Courier New"/>
+          <w:sz w:val="22"/>
+          <w:szCs w:val="22"/>
+        </w:rPr>
+        <w:t xml:space="preserve"> is Iejoor, de sombere ezel. Hij verwacht altijd het ergste en ziet in elke gebeurtenis een reden tot pessimisme. Toch wordt hij door niemand afgewezen. Zijn vrienden accepteren hem zoals hij is. Dat blijkt uit het verhaal over zijn verjaardag. Poeh wil hem een pot honing geven, maar eet onderweg de inhoud op. Knorretje heeft een mooie ballon gekocht, maar laat die per ongeluk knappen. Uiteindelijk krijgt Iejoor een lege honingpot en een kapotte ballon. </w:t>
+      </w:r>
+      <w:r>
+        <w:rPr>
+          <w:rFonts w:ascii="Courier New" w:hAnsi="Courier New" w:cs="Courier New"/>
+          <w:sz w:val="22"/>
+          <w:szCs w:val="22"/>
+        </w:rPr>
+        <w:t xml:space="preserve">Maar uiteindelijk ziet </w:t>
+      </w:r>
+      <w:r>
+        <w:rPr>
+          <w:rFonts w:ascii="Courier New" w:hAnsi="Courier New" w:cs="Courier New"/>
+          <w:sz w:val="22"/>
+          <w:szCs w:val="22"/>
+        </w:rPr>
+        <w:t xml:space="preserve">hij </w:t>
+      </w:r>
+      <w:r>
+        <w:rPr>
+          <w:rFonts w:ascii="Courier New" w:hAnsi="Courier New" w:cs="Courier New"/>
+          <w:sz w:val="22"/>
+          <w:szCs w:val="22"/>
+        </w:rPr>
+        <w:t xml:space="preserve">dat hij, heel handig, een pot krijgt waar hij dingen in kan stoppen en uit kan halen. </w:t>
       </w:r>
       <w:r>
         <w:rPr>
@@ -1422,7 +1494,7 @@
           <w:sz w:val="22"/>
           <w:szCs w:val="22"/>
         </w:rPr>
-        <w:t>“</w:t>
+        <w:t>“Maar Iejoor luisterde niet. Hij haalde de ballon eruit en stopte hem er weer in, zo gelukkig als hij maar kon zijn...</w:t>
       </w:r>
       <w:r>
         <w:rPr>
@@ -1432,16 +1504,6 @@
           <w:sz w:val="22"/>
           <w:szCs w:val="22"/>
         </w:rPr>
-        <w:t>Maar Iejoor luisterde niet. Hij haalde de ballon eruit en stopte hem er weer in, zo gelukkig als hij maar kon zijn...</w:t>
-      </w:r>
-      <w:r>
-        <w:rPr>
-          <w:rFonts w:ascii="Courier New" w:hAnsi="Courier New" w:cs="Courier New"/>
-          <w:i/>
-          <w:iCs/>
-          <w:sz w:val="22"/>
-          <w:szCs w:val="22"/>
-        </w:rPr>
         <w:t>”</w:t>
       </w:r>
       <w:r>
@@ -1498,7 +1560,15 @@
           <w:sz w:val="22"/>
           <w:szCs w:val="22"/>
         </w:rPr>
-        <w:t>, dat</w:t>
+        <w:t xml:space="preserve"> en wel</w:t>
+      </w:r>
+      <w:r>
+        <w:rPr>
+          <w:rFonts w:ascii="Courier New" w:hAnsi="Courier New" w:cs="Courier New"/>
+          <w:sz w:val="22"/>
+          <w:szCs w:val="22"/>
+        </w:rPr>
+        <w:t xml:space="preserve"> dat</w:t>
       </w:r>
       <w:r>
         <w:rPr>
@@ -1589,7 +1659,23 @@
           <w:sz w:val="22"/>
           <w:szCs w:val="22"/>
         </w:rPr>
-        <w:t xml:space="preserve"> een kleine samenleving waarin verschillen niet worden weggewerkt</w:t>
+        <w:t xml:space="preserve"> een kleine samenleving</w:t>
+      </w:r>
+      <w:r>
+        <w:rPr>
+          <w:rFonts w:ascii="Courier New" w:hAnsi="Courier New" w:cs="Courier New"/>
+          <w:sz w:val="22"/>
+          <w:szCs w:val="22"/>
+        </w:rPr>
+        <w:t xml:space="preserve"> die een Grote Gemeenschap is</w:t>
+      </w:r>
+      <w:r>
+        <w:rPr>
+          <w:rFonts w:ascii="Courier New" w:hAnsi="Courier New" w:cs="Courier New"/>
+          <w:sz w:val="22"/>
+          <w:szCs w:val="22"/>
+        </w:rPr>
+        <w:t xml:space="preserve"> waarin verschillen niet worden weggewerkt</w:t>
       </w:r>
       <w:r>
         <w:rPr>
@@ -1833,7 +1919,23 @@
           <w:sz w:val="22"/>
           <w:szCs w:val="22"/>
         </w:rPr>
-        <w:t xml:space="preserve"> als fouten die moeten worden gecorrigeerd. Integendeel, zij maken deel uit van de eigenheid van elk personage. Het Honderd Bunderbos is een gemeenschap waarin niemand hoeft te bewijzen dat hij slim, sterk of succesvol is om erbij te horen</w:t>
+        <w:t xml:space="preserve"> als fouten die moeten worden gecorrigeerd. Integendeel, zij maken deel uit van de eigenheid van elk personage</w:t>
+      </w:r>
+      <w:r>
+        <w:rPr>
+          <w:rFonts w:ascii="Courier New" w:hAnsi="Courier New" w:cs="Courier New"/>
+          <w:sz w:val="22"/>
+          <w:szCs w:val="22"/>
+        </w:rPr>
+        <w:t xml:space="preserve"> individueel en van de Grote Gemeenschap als geheel</w:t>
+      </w:r>
+      <w:r>
+        <w:rPr>
+          <w:rFonts w:ascii="Courier New" w:hAnsi="Courier New" w:cs="Courier New"/>
+          <w:sz w:val="22"/>
+          <w:szCs w:val="22"/>
+        </w:rPr>
+        <w:t>. Het Honderd Bunderbos is een gemeenschap waarin niemand hoeft te bewijzen dat hij slim, sterk of succesvol is om erbij te horen</w:t>
       </w:r>
       <w:r>
         <w:rPr>
@@ -1959,108 +2061,37 @@
         </w:rPr>
         <w:t> daarom meer dan een kinderboek. Het is een ode aan vriendschap, verbeelding en menselijke verbondenheid. Achter de humor en de speelse avonturen schuilt een wijsheid die zowel kinderen als volwassenen aanspreekt. In de rustige wereld van het Honderd Bunderbos vinden lezers een herinnering aan wat werkelijk van waarde is: aandacht voor elkaar, ruimte voor verschillen en het vermogen om met verwondering naar de wereld te blijven kijken.</w:t>
       </w:r>
-    </w:p>
-    <w:p>
-      <w:pPr>
-        <w:spacing w:line="360" w:lineRule="auto"/>
-        <w:rPr>
-          <w:rFonts w:ascii="Courier New" w:hAnsi="Courier New" w:cs="Courier New"/>
-          <w:sz w:val="22"/>
-          <w:szCs w:val="22"/>
-        </w:rPr>
-      </w:pPr>
-      <w:r>
-        <w:rPr>
-          <w:rFonts w:ascii="Courier New" w:hAnsi="Courier New" w:cs="Courier New"/>
-          <w:sz w:val="22"/>
-          <w:szCs w:val="22"/>
-        </w:rPr>
-        <w:tab/>
-      </w:r>
-      <w:r>
-        <w:rPr>
-          <w:rFonts w:ascii="Courier New" w:hAnsi="Courier New" w:cs="Courier New"/>
-          <w:sz w:val="22"/>
-          <w:szCs w:val="22"/>
-        </w:rPr>
-        <w:t>In Winnie-the-Pooh draait alles om vriendschap, kleine zorgen en een overzichtelijke gemeenschap. De dieren in het Honderd Bunderbos hebben hun eigenaardigheden: Misverstanden worden opgelost door geduld, humor en wederzijdse acceptatie. Niemand probeert de ander te domineren. Zelfs wanneer iemand ongelijk heeft, blijft hij deel van de groep.</w:t>
-      </w:r>
-      <w:r>
-        <w:rPr>
-          <w:rFonts w:ascii="Courier New" w:hAnsi="Courier New" w:cs="Courier New"/>
-          <w:sz w:val="22"/>
-          <w:szCs w:val="22"/>
-        </w:rPr>
-        <w:t xml:space="preserve"> De grote mannen</w:t>
-      </w:r>
-      <w:r>
-        <w:rPr>
-          <w:rFonts w:ascii="Courier New" w:hAnsi="Courier New" w:cs="Courier New"/>
-          <w:sz w:val="22"/>
-          <w:szCs w:val="22"/>
-        </w:rPr>
-        <w:t>wereld rond Donald Trump, JD Vance en Pete Hegseth is bijna het tegenovergestelde</w:t>
-      </w:r>
-      <w:r>
-        <w:rPr>
-          <w:rFonts w:ascii="Courier New" w:hAnsi="Courier New" w:cs="Courier New"/>
-          <w:sz w:val="22"/>
-          <w:szCs w:val="22"/>
-        </w:rPr>
-        <w:t xml:space="preserve">, met zijn </w:t>
-      </w:r>
-      <w:r>
-        <w:rPr>
-          <w:rFonts w:ascii="Courier New" w:hAnsi="Courier New" w:cs="Courier New"/>
-          <w:sz w:val="22"/>
-          <w:szCs w:val="22"/>
-        </w:rPr>
-        <w:t xml:space="preserve">macht, competitie, loyaliteit en conflict centraal. Tegenstanders worden vaak niet gezien als vrienden met een andere mening, maar als </w:t>
-      </w:r>
-      <w:r>
-        <w:rPr>
-          <w:rFonts w:ascii="Courier New" w:hAnsi="Courier New" w:cs="Courier New"/>
-          <w:sz w:val="22"/>
-          <w:szCs w:val="22"/>
-        </w:rPr>
-        <w:lastRenderedPageBreak/>
-        <w:t>rivalen die moeten worden verslagen. De taal is scherper, de inzet groter en de gevolgen reiken veel verder dan het bos van Poeh.</w:t>
-      </w:r>
-    </w:p>
-    <w:p>
-      <w:pPr>
-        <w:spacing w:line="360" w:lineRule="auto"/>
-        <w:rPr>
-          <w:rFonts w:ascii="Courier New" w:hAnsi="Courier New" w:cs="Courier New"/>
-          <w:sz w:val="22"/>
-          <w:szCs w:val="22"/>
-        </w:rPr>
-      </w:pPr>
-      <w:r>
-        <w:rPr>
-          <w:rFonts w:ascii="Courier New" w:hAnsi="Courier New" w:cs="Courier New"/>
-          <w:sz w:val="22"/>
-          <w:szCs w:val="22"/>
-        </w:rPr>
-        <w:t>Je zou kunnen zeggen dat de wereld van Poeh een model is van een gemeenschap waarin karakterverschillen worden verdragen. Iejoor mag somber zijn, Knorretje bang en Poeh een beetje naïef; niemand wordt daarom uitgesloten. In de hedendaagse politiek is er vaak minder ruimte voor zulke mildheid. Politieke communicatie beloont kracht, snelheid en zekerheid meer dan twijfel, geduld en begrip.</w:t>
-      </w:r>
-    </w:p>
-    <w:p>
-      <w:pPr>
-        <w:spacing w:line="360" w:lineRule="auto"/>
-        <w:rPr>
-          <w:rFonts w:ascii="Courier New" w:hAnsi="Courier New" w:cs="Courier New"/>
-          <w:sz w:val="22"/>
-          <w:szCs w:val="22"/>
-        </w:rPr>
-      </w:pPr>
-      <w:r>
-        <w:rPr>
-          <w:rFonts w:ascii="Courier New" w:hAnsi="Courier New" w:cs="Courier New"/>
-          <w:sz w:val="22"/>
-          <w:szCs w:val="22"/>
-        </w:rPr>
-        <w:t>Vanuit een filosofisch perspectief, bijvoorbeeld dat van John Dewey, zou het Honderd Bunderbos zelfs kunnen worden gezien als een kleine democratische gemeenschap. Problemen worden gezamenlijk aangepakt, iedereen heeft een plaats en de waarde van een lid hangt niet af van macht of succes. Dewey zou waarschijnlijk meer waardering hebben gehad voor de manier waarop Poeh en zijn vrienden met verschillen omgaan dan voor een politieke cultuur die sterk draait om winnen en verliezen.</w:t>
+      <w:r>
+        <w:rPr>
+          <w:rFonts w:ascii="Courier New" w:hAnsi="Courier New" w:cs="Courier New"/>
+          <w:sz w:val="22"/>
+          <w:szCs w:val="22"/>
+        </w:rPr>
+        <w:t xml:space="preserve"> </w:t>
+      </w:r>
+      <w:r>
+        <w:rPr>
+          <w:rFonts w:ascii="Courier New" w:hAnsi="Courier New" w:cs="Courier New"/>
+          <w:sz w:val="22"/>
+          <w:szCs w:val="22"/>
+        </w:rPr>
+        <w:t>In Winnie-the-Pooh draait alles om vriendschap, kleine zorgen</w:t>
+      </w:r>
+      <w:r>
+        <w:rPr>
+          <w:rFonts w:ascii="Courier New" w:hAnsi="Courier New" w:cs="Courier New"/>
+          <w:sz w:val="22"/>
+          <w:szCs w:val="22"/>
+        </w:rPr>
+        <w:t xml:space="preserve"> oplossen</w:t>
+      </w:r>
+      <w:r>
+        <w:rPr>
+          <w:rFonts w:ascii="Courier New" w:hAnsi="Courier New" w:cs="Courier New"/>
+          <w:sz w:val="22"/>
+          <w:szCs w:val="22"/>
+        </w:rPr>
+        <w:t xml:space="preserve"> en een overzichtelijke gemeenschap. De dieren in het Honderd Bunderbos hebben hun eigenaardigheden: Misverstanden worden opgelost door geduld, humor en wederzijdse acceptatie. Niemand probeert de ander te domineren. </w:t>
       </w:r>
     </w:p>
     <w:p>
@@ -2079,25 +2110,79 @@
           <w:sz w:val="22"/>
           <w:szCs w:val="22"/>
         </w:rPr>
-        <w:t>Misschien ligt juist daarin de blijvende aantrekkingskracht van Poeh. Het boek herinnert eraan dat zelfs in een complexe wereld eigenschappen als vriendelijkheid, bescheidenheid, geduld en aandacht voor anderen waardevol blijven. Waar de politieke wereld vaak draait om macht, draait Poehs wereld om verbondenheid. En Milne lijkt te suggereren dat verbondenheid uiteindelijk belangrijker is dan gelijk krijgen.</w:t>
+        <w:t xml:space="preserve">Die tijdloze wereld van deze Grote Gemeenschap is heel anders dan de Echte Mannenwereld van tegenwoordig met onze roodharige hoofdpersoon. Vriendschap, verbeelding en verbondenheid hebben </w:t>
+      </w:r>
+      <w:r>
+        <w:rPr>
+          <w:rFonts w:ascii="Courier New" w:hAnsi="Courier New" w:cs="Courier New"/>
+          <w:sz w:val="22"/>
+          <w:szCs w:val="22"/>
+        </w:rPr>
+        <w:lastRenderedPageBreak/>
+        <w:t xml:space="preserve">plaatsgemaakt voor haat, rancune en angst.  </w:t>
+      </w:r>
+      <w:r>
+        <w:rPr>
+          <w:rFonts w:ascii="Courier New" w:hAnsi="Courier New" w:cs="Courier New"/>
+          <w:sz w:val="22"/>
+          <w:szCs w:val="22"/>
+        </w:rPr>
+        <w:t>Zo begon Milne zijn boek:</w:t>
+      </w:r>
+      <w:r>
+        <w:rPr>
+          <w:rFonts w:ascii="Courier New" w:hAnsi="Courier New" w:cs="Courier New"/>
+          <w:sz w:val="22"/>
+          <w:szCs w:val="22"/>
+        </w:rPr>
+        <w:t xml:space="preserve"> </w:t>
+      </w:r>
+      <w:r>
+        <w:rPr>
+          <w:rFonts w:ascii="Courier New" w:hAnsi="Courier New" w:cs="Courier New"/>
+          <w:i/>
+          <w:iCs/>
+          <w:sz w:val="22"/>
+          <w:szCs w:val="22"/>
+        </w:rPr>
+        <w:t>“HIER KOMT EDWARD BEER, die nu de trap afdaalt: bonk, bonk, bonk, op zijn achterhoofd, achter Christopher Robin aan. Voor zover hij weet, is dit de enige manier om van een trap af te komen. Maar soms denkt hij dat er vast nog een andere manier bestaat, als hij maar even kon ophouden met bonken om daarover na te denken. En dan denkt hij weer dat die andere manier misschien helemaal niet bestaat. Hoe dan ook, hij is nu beneden en klaar om aan u voorgesteld te worden. Winnie de Poeh.”</w:t>
+      </w:r>
+      <w:r>
+        <w:rPr>
+          <w:rFonts w:ascii="Courier New" w:hAnsi="Courier New" w:cs="Courier New"/>
+          <w:sz w:val="22"/>
+          <w:szCs w:val="22"/>
+        </w:rPr>
+        <w:t xml:space="preserve"> Nu is het: </w:t>
       </w:r>
     </w:p>
     <w:p>
       <w:pPr>
         <w:spacing w:line="360" w:lineRule="auto"/>
+        <w:ind w:firstLine="720"/>
         <w:rPr>
           <w:rFonts w:ascii="Courier New" w:hAnsi="Courier New" w:cs="Courier New"/>
           <w:sz w:val="22"/>
           <w:szCs w:val="22"/>
         </w:rPr>
       </w:pPr>
-      <w:r>
-        <w:rPr>
-          <w:rFonts w:ascii="Courier New" w:hAnsi="Courier New" w:cs="Courier New"/>
-          <w:sz w:val="22"/>
-          <w:szCs w:val="22"/>
-        </w:rPr>
-        <w:tab/>
+    </w:p>
+    <w:p>
+      <w:pPr>
+        <w:spacing w:line="360" w:lineRule="auto"/>
+        <w:rPr>
+          <w:rFonts w:ascii="Courier New" w:hAnsi="Courier New" w:cs="Courier New"/>
+          <w:sz w:val="22"/>
+          <w:szCs w:val="22"/>
+        </w:rPr>
+      </w:pPr>
+      <w:r>
+        <w:rPr>
+          <w:rFonts w:ascii="Courier New" w:hAnsi="Courier New" w:cs="Courier New"/>
+          <w:sz w:val="22"/>
+          <w:szCs w:val="22"/>
+        </w:rPr>
+        <w:t xml:space="preserve">Millne, A.A. with decorations by E.H. Shepard (2025/1926). </w:t>
       </w:r>
       <w:r>
         <w:rPr>
@@ -2107,7 +2192,15 @@
           <w:sz w:val="22"/>
           <w:szCs w:val="22"/>
         </w:rPr>
-        <w:t>“</w:t>
+        <w:t>Winnie-the-Poeh.</w:t>
+      </w:r>
+      <w:r>
+        <w:rPr>
+          <w:rFonts w:ascii="Courier New" w:hAnsi="Courier New" w:cs="Courier New"/>
+          <w:sz w:val="22"/>
+          <w:szCs w:val="22"/>
+        </w:rPr>
+        <w:t xml:space="preserve"> Dublin: HarperCollins</w:t>
       </w:r>
       <w:r>
         <w:rPr>
@@ -2117,45 +2210,7 @@
           <w:sz w:val="22"/>
           <w:szCs w:val="22"/>
         </w:rPr>
-        <w:t>HIER KOMT EDWARD BEER, die nu de trap afdaalt: bonk, bonk, bonk, op zijn achterhoofd, achter Christopher Robin aan. Voor zover hij weet, is dit de enige manier om van een trap af te komen. Maar soms denkt hij dat er vast nog een andere manier bestaat, als hij maar even kon ophouden met bonken om daarover na te denken. En dan denkt hij weer dat die andere manier misschien helemaal niet bestaat. Hoe dan ook, hij is nu beneden en klaar om aan u voorgesteld te worden.</w:t>
-      </w:r>
-      <w:r>
-        <w:rPr>
-          <w:rFonts w:ascii="Courier New" w:hAnsi="Courier New" w:cs="Courier New"/>
-          <w:i/>
-          <w:iCs/>
-          <w:sz w:val="22"/>
-          <w:szCs w:val="22"/>
-        </w:rPr>
-        <w:t xml:space="preserve"> </w:t>
-      </w:r>
-      <w:r>
-        <w:rPr>
-          <w:rFonts w:ascii="Courier New" w:hAnsi="Courier New" w:cs="Courier New"/>
-          <w:i/>
-          <w:iCs/>
-          <w:sz w:val="22"/>
-          <w:szCs w:val="22"/>
-        </w:rPr>
-        <w:t>Winnie de Poeh.</w:t>
-      </w:r>
-      <w:r>
-        <w:rPr>
-          <w:rFonts w:ascii="Courier New" w:hAnsi="Courier New" w:cs="Courier New"/>
-          <w:i/>
-          <w:iCs/>
-          <w:sz w:val="22"/>
-          <w:szCs w:val="22"/>
-        </w:rPr>
-        <w:t>”,</w:t>
-      </w:r>
-      <w:r>
-        <w:rPr>
-          <w:rFonts w:ascii="Courier New" w:hAnsi="Courier New" w:cs="Courier New"/>
-          <w:sz w:val="22"/>
-          <w:szCs w:val="22"/>
-        </w:rPr>
-        <w:t xml:space="preserve"> zo begint Milne zijn boek over de Grote Gemeenschap. </w:t>
+        <w:t>Publishers</w:t>
       </w:r>
     </w:p>
     <w:p>
@@ -2896,6 +2951,7 @@
   <w:style w:type="character" w:default="1" w:styleId="DefaultParagraphFont">
     <w:name w:val="Default Paragraph Font"/>
     <w:uiPriority w:val="1"/>
+    <w:semiHidden/>
     <w:unhideWhenUsed/>
   </w:style>
   <w:style w:type="table" w:default="1" w:styleId="TableNormal">

</xml_diff>

<commit_message>
26-06-23, Grote Gemeenschap bijgewerkt
</commit_message>
<xml_diff>
--- a/BlogsWord/DeGrote Gemeenschap.docx
+++ b/BlogsWord/DeGrote Gemeenschap.docx
@@ -2100,6 +2100,8 @@
         <w:ind w:firstLine="720"/>
         <w:rPr>
           <w:rFonts w:ascii="Courier New" w:hAnsi="Courier New" w:cs="Courier New"/>
+          <w:i/>
+          <w:iCs/>
           <w:sz w:val="22"/>
           <w:szCs w:val="22"/>
         </w:rPr>
@@ -2111,6 +2113,14 @@
           <w:szCs w:val="22"/>
         </w:rPr>
         <w:t xml:space="preserve">Die tijdloze wereld van deze Grote Gemeenschap is heel anders dan de Echte Mannenwereld van tegenwoordig met onze roodharige hoofdpersoon. Vriendschap, verbeelding en verbondenheid hebben </w:t>
+      </w:r>
+      <w:r>
+        <w:rPr>
+          <w:rFonts w:ascii="Courier New" w:hAnsi="Courier New" w:cs="Courier New"/>
+          <w:sz w:val="22"/>
+          <w:szCs w:val="22"/>
+        </w:rPr>
+        <w:t xml:space="preserve">er </w:t>
       </w:r>
       <w:r>
         <w:rPr>
@@ -2127,7 +2137,47 @@
           <w:sz w:val="22"/>
           <w:szCs w:val="22"/>
         </w:rPr>
-        <w:t>Zo begon Milne zijn boek:</w:t>
+        <w:t xml:space="preserve">Aan het begin van </w:t>
+      </w:r>
+      <w:r>
+        <w:rPr>
+          <w:rFonts w:ascii="Courier New" w:hAnsi="Courier New" w:cs="Courier New"/>
+          <w:sz w:val="22"/>
+          <w:szCs w:val="22"/>
+        </w:rPr>
+        <w:t>Milne</w:t>
+      </w:r>
+      <w:r>
+        <w:rPr>
+          <w:rFonts w:ascii="Courier New" w:hAnsi="Courier New" w:cs="Courier New"/>
+          <w:sz w:val="22"/>
+          <w:szCs w:val="22"/>
+        </w:rPr>
+        <w:t>’s</w:t>
+      </w:r>
+      <w:r>
+        <w:rPr>
+          <w:rFonts w:ascii="Courier New" w:hAnsi="Courier New" w:cs="Courier New"/>
+          <w:sz w:val="22"/>
+          <w:szCs w:val="22"/>
+        </w:rPr>
+        <w:t xml:space="preserve"> boek</w:t>
+      </w:r>
+      <w:r>
+        <w:rPr>
+          <w:rFonts w:ascii="Courier New" w:hAnsi="Courier New" w:cs="Courier New"/>
+          <w:sz w:val="22"/>
+          <w:szCs w:val="22"/>
+        </w:rPr>
+        <w:t xml:space="preserve"> moest ik denk</w:t>
+      </w:r>
+      <w:r>
+        <w:rPr>
+          <w:rFonts w:ascii="Courier New" w:hAnsi="Courier New" w:cs="Courier New"/>
+          <w:sz w:val="22"/>
+          <w:szCs w:val="22"/>
+        </w:rPr>
+        <w:t>:</w:t>
       </w:r>
       <w:r>
         <w:rPr>
@@ -2153,7 +2203,62 @@
           <w:sz w:val="22"/>
           <w:szCs w:val="22"/>
         </w:rPr>
-        <w:t xml:space="preserve"> Nu is het: </w:t>
+        <w:t xml:space="preserve"> </w:t>
+      </w:r>
+      <w:r>
+        <w:rPr>
+          <w:rFonts w:ascii="Courier New" w:hAnsi="Courier New" w:cs="Courier New"/>
+          <w:sz w:val="22"/>
+          <w:szCs w:val="22"/>
+        </w:rPr>
+        <w:t>Dat klonk heel anders dan de roodharige hoofdpersoon die op 27 maart over Iran zei:</w:t>
+      </w:r>
+      <w:r>
+        <w:rPr>
+          <w:rFonts w:ascii="-webkit-standard" w:hAnsi="-webkit-standard"/>
+          <w:color w:val="000000"/>
+          <w:sz w:val="27"/>
+          <w:szCs w:val="27"/>
+        </w:rPr>
+        <w:t xml:space="preserve"> </w:t>
+      </w:r>
+      <w:r>
+        <w:rPr>
+          <w:rFonts w:ascii="Courier New" w:hAnsi="Courier New" w:cs="Courier New"/>
+          <w:sz w:val="22"/>
+          <w:szCs w:val="22"/>
+        </w:rPr>
+        <w:t>“</w:t>
+      </w:r>
+      <w:r>
+        <w:rPr>
+          <w:rFonts w:ascii="Courier New" w:hAnsi="Courier New" w:cs="Courier New"/>
+          <w:i/>
+          <w:iCs/>
+          <w:sz w:val="22"/>
+          <w:szCs w:val="22"/>
+        </w:rPr>
+        <w:t>Je moet het zien</w:t>
+      </w:r>
+      <w:r>
+        <w:rPr>
+          <w:rFonts w:ascii="Courier New" w:hAnsi="Courier New" w:cs="Courier New"/>
+          <w:i/>
+          <w:iCs/>
+          <w:sz w:val="22"/>
+          <w:szCs w:val="22"/>
+        </w:rPr>
+        <w:t xml:space="preserve">. </w:t>
+      </w:r>
+      <w:r>
+        <w:rPr>
+          <w:rFonts w:ascii="Courier New" w:hAnsi="Courier New" w:cs="Courier New"/>
+          <w:i/>
+          <w:iCs/>
+          <w:sz w:val="22"/>
+          <w:szCs w:val="22"/>
+        </w:rPr>
+        <w:t>Het is ontzettend gaaf. Raketten die worden afgevuurd, raketten die worden afgevuurd, raketten die worden afgevuurd. Ze blijven maar afgaan … En dan, na zeven seconden: vuur, vuur, vuur. Het meest ongelooflijke dat je je kunt voorstellen. Vuur, boem, vuur, boem.”</w:t>
       </w:r>
     </w:p>
     <w:p>

</xml_diff>

<commit_message>
26-06-24, De Grote Gemeenschap geplaatst.
</commit_message>
<xml_diff>
--- a/BlogsWord/DeGrote Gemeenschap.docx
+++ b/BlogsWord/DeGrote Gemeenschap.docx
@@ -198,15 +198,47 @@
           <w:sz w:val="22"/>
           <w:szCs w:val="22"/>
         </w:rPr>
-        <w:t>Het boek verscheen honderd jaar geleden en sinds</w:t>
-      </w:r>
-      <w:r>
-        <w:rPr>
-          <w:rFonts w:ascii="Courier New" w:hAnsi="Courier New" w:cs="Courier New"/>
-          <w:sz w:val="22"/>
-          <w:szCs w:val="22"/>
-        </w:rPr>
-        <w:t xml:space="preserve"> zijn eerste optreden in 1926 heeft deze vriendelijke beer generaties lezers weten te bekoren. Het boek </w:t>
+        <w:t>Het boek verscheen honderd jaar geleden</w:t>
+      </w:r>
+      <w:r>
+        <w:rPr>
+          <w:rFonts w:ascii="Courier New" w:hAnsi="Courier New" w:cs="Courier New"/>
+          <w:sz w:val="22"/>
+          <w:szCs w:val="22"/>
+        </w:rPr>
+        <w:t>. S</w:t>
+      </w:r>
+      <w:r>
+        <w:rPr>
+          <w:rFonts w:ascii="Courier New" w:hAnsi="Courier New" w:cs="Courier New"/>
+          <w:sz w:val="22"/>
+          <w:szCs w:val="22"/>
+        </w:rPr>
+        <w:t>inds</w:t>
+      </w:r>
+      <w:r>
+        <w:rPr>
+          <w:rFonts w:ascii="Courier New" w:hAnsi="Courier New" w:cs="Courier New"/>
+          <w:sz w:val="22"/>
+          <w:szCs w:val="22"/>
+        </w:rPr>
+        <w:t xml:space="preserve"> zijn eerste optreden in 1926 heeft deze vriendelijke beer generaties lezers </w:t>
+      </w:r>
+      <w:r>
+        <w:rPr>
+          <w:rFonts w:ascii="Courier New" w:hAnsi="Courier New" w:cs="Courier New"/>
+          <w:sz w:val="22"/>
+          <w:szCs w:val="22"/>
+        </w:rPr>
+        <w:t>geïnspireerd</w:t>
+      </w:r>
+      <w:r>
+        <w:rPr>
+          <w:rFonts w:ascii="Courier New" w:hAnsi="Courier New" w:cs="Courier New"/>
+          <w:sz w:val="22"/>
+          <w:szCs w:val="22"/>
+        </w:rPr>
+        <w:t>. Het boek </w:t>
       </w:r>
       <w:r>
         <w:rPr>
@@ -280,7 +312,15 @@
           <w:sz w:val="22"/>
           <w:szCs w:val="22"/>
         </w:rPr>
-        <w:t xml:space="preserve"> A</w:t>
+        <w:t xml:space="preserve"> </w:t>
+      </w:r>
+      <w:r>
+        <w:rPr>
+          <w:rFonts w:ascii="Courier New" w:hAnsi="Courier New" w:cs="Courier New"/>
+          <w:sz w:val="22"/>
+          <w:szCs w:val="22"/>
+        </w:rPr>
+        <w:t>Maar a</w:t>
       </w:r>
       <w:r>
         <w:rPr>
@@ -435,15 +475,23 @@
           <w:sz w:val="22"/>
           <w:szCs w:val="22"/>
         </w:rPr>
-        <w:t xml:space="preserve"> is </w:t>
-      </w:r>
-      <w:r>
-        <w:rPr>
-          <w:rFonts w:ascii="Courier New" w:hAnsi="Courier New" w:cs="Courier New"/>
-          <w:sz w:val="22"/>
-          <w:szCs w:val="22"/>
-        </w:rPr>
-        <w:t xml:space="preserve">het </w:t>
+        <w:t xml:space="preserve"> </w:t>
+      </w:r>
+      <w:r>
+        <w:rPr>
+          <w:rFonts w:ascii="Courier New" w:hAnsi="Courier New" w:cs="Courier New"/>
+          <w:sz w:val="22"/>
+          <w:szCs w:val="22"/>
+        </w:rPr>
+        <w:t>zelf leeft</w:t>
+      </w:r>
+      <w:r>
+        <w:rPr>
+          <w:rFonts w:ascii="Courier New" w:hAnsi="Courier New" w:cs="Courier New"/>
+          <w:sz w:val="22"/>
+          <w:szCs w:val="22"/>
+        </w:rPr>
+        <w:t xml:space="preserve"> </w:t>
       </w:r>
       <w:r>
         <w:rPr>
@@ -459,6 +507,158 @@
           <w:sz w:val="22"/>
           <w:szCs w:val="22"/>
         </w:rPr>
+        <w:t xml:space="preserve"> tussen de dieren leeft</w:t>
+      </w:r>
+      <w:r>
+        <w:rPr>
+          <w:rFonts w:ascii="Courier New" w:hAnsi="Courier New" w:cs="Courier New"/>
+          <w:sz w:val="22"/>
+          <w:szCs w:val="22"/>
+        </w:rPr>
+        <w:t xml:space="preserve">, veelal in de rol van </w:t>
+      </w:r>
+      <w:r>
+        <w:rPr>
+          <w:rFonts w:ascii="Courier New" w:hAnsi="Courier New" w:cs="Courier New"/>
+          <w:sz w:val="22"/>
+          <w:szCs w:val="22"/>
+        </w:rPr>
+        <w:t xml:space="preserve">een rustige en verstandige gids. </w:t>
+      </w:r>
+      <w:r>
+        <w:rPr>
+          <w:rFonts w:ascii="Courier New" w:hAnsi="Courier New" w:cs="Courier New"/>
+          <w:sz w:val="22"/>
+          <w:szCs w:val="22"/>
+        </w:rPr>
+        <w:t xml:space="preserve">De verhalen </w:t>
+      </w:r>
+      <w:r>
+        <w:rPr>
+          <w:rFonts w:ascii="Courier New" w:hAnsi="Courier New" w:cs="Courier New"/>
+          <w:sz w:val="22"/>
+          <w:szCs w:val="22"/>
+        </w:rPr>
+        <w:t>zelf zoek</w:t>
+      </w:r>
+      <w:r>
+        <w:rPr>
+          <w:rFonts w:ascii="Courier New" w:hAnsi="Courier New" w:cs="Courier New"/>
+          <w:sz w:val="22"/>
+          <w:szCs w:val="22"/>
+        </w:rPr>
+        <w:t>en</w:t>
+      </w:r>
+      <w:r>
+        <w:rPr>
+          <w:rFonts w:ascii="Courier New" w:hAnsi="Courier New" w:cs="Courier New"/>
+          <w:sz w:val="22"/>
+          <w:szCs w:val="22"/>
+        </w:rPr>
+        <w:t xml:space="preserve"> voortdurend </w:t>
+      </w:r>
+      <w:r>
+        <w:rPr>
+          <w:rFonts w:ascii="Courier New" w:hAnsi="Courier New" w:cs="Courier New"/>
+          <w:sz w:val="22"/>
+          <w:szCs w:val="22"/>
+        </w:rPr>
+        <w:t xml:space="preserve">de grens </w:t>
+      </w:r>
+      <w:r>
+        <w:rPr>
+          <w:rFonts w:ascii="Courier New" w:hAnsi="Courier New" w:cs="Courier New"/>
+          <w:sz w:val="22"/>
+          <w:szCs w:val="22"/>
+        </w:rPr>
+        <w:t xml:space="preserve">op tussen werkelijkheid en fantasie. </w:t>
+      </w:r>
+      <w:r>
+        <w:rPr>
+          <w:rFonts w:ascii="Courier New" w:hAnsi="Courier New" w:cs="Courier New"/>
+          <w:sz w:val="22"/>
+          <w:szCs w:val="22"/>
+        </w:rPr>
+        <w:t>De lezer</w:t>
+      </w:r>
+      <w:r>
+        <w:rPr>
+          <w:rFonts w:ascii="Courier New" w:hAnsi="Courier New" w:cs="Courier New"/>
+          <w:sz w:val="22"/>
+          <w:szCs w:val="22"/>
+        </w:rPr>
+        <w:t xml:space="preserve"> weet dat het om </w:t>
+      </w:r>
+      <w:r>
+        <w:rPr>
+          <w:rFonts w:ascii="Courier New" w:hAnsi="Courier New" w:cs="Courier New"/>
+          <w:sz w:val="22"/>
+          <w:szCs w:val="22"/>
+        </w:rPr>
+        <w:t xml:space="preserve">poppen en </w:t>
+      </w:r>
+      <w:r>
+        <w:rPr>
+          <w:rFonts w:ascii="Courier New" w:hAnsi="Courier New" w:cs="Courier New"/>
+          <w:sz w:val="22"/>
+          <w:szCs w:val="22"/>
+        </w:rPr>
+        <w:t>speelgoed gaat d</w:t>
+      </w:r>
+      <w:r>
+        <w:rPr>
+          <w:rFonts w:ascii="Courier New" w:hAnsi="Courier New" w:cs="Courier New"/>
+          <w:sz w:val="22"/>
+          <w:szCs w:val="22"/>
+        </w:rPr>
+        <w:t>ie</w:t>
+      </w:r>
+      <w:r>
+        <w:rPr>
+          <w:rFonts w:ascii="Courier New" w:hAnsi="Courier New" w:cs="Courier New"/>
+          <w:sz w:val="22"/>
+          <w:szCs w:val="22"/>
+        </w:rPr>
+        <w:t xml:space="preserve"> tot leven kom</w:t>
+      </w:r>
+      <w:r>
+        <w:rPr>
+          <w:rFonts w:ascii="Courier New" w:hAnsi="Courier New" w:cs="Courier New"/>
+          <w:sz w:val="22"/>
+          <w:szCs w:val="22"/>
+        </w:rPr>
+        <w:t>en</w:t>
+      </w:r>
+      <w:r>
+        <w:rPr>
+          <w:rFonts w:ascii="Courier New" w:hAnsi="Courier New" w:cs="Courier New"/>
+          <w:sz w:val="22"/>
+          <w:szCs w:val="22"/>
+        </w:rPr>
+        <w:t xml:space="preserve"> in de verbeelding van een kind</w:t>
+      </w:r>
+      <w:r>
+        <w:rPr>
+          <w:rFonts w:ascii="Courier New" w:hAnsi="Courier New" w:cs="Courier New"/>
+          <w:sz w:val="22"/>
+          <w:szCs w:val="22"/>
+        </w:rPr>
+        <w:t>. Binnen de verhalen in het Honderd Bunderbos</w:t>
+      </w:r>
+      <w:r>
+        <w:rPr>
+          <w:rFonts w:ascii="Courier New" w:hAnsi="Courier New" w:cs="Courier New"/>
+          <w:sz w:val="22"/>
+          <w:szCs w:val="22"/>
+        </w:rPr>
+        <w:t xml:space="preserve"> zijn de dieren volwaardige personen met hun eigen karakter, zorgen en verlangens.</w:t>
+      </w:r>
+      <w:r>
+        <w:rPr>
+          <w:rFonts w:ascii="Courier New" w:hAnsi="Courier New" w:cs="Courier New"/>
+          <w:sz w:val="22"/>
+          <w:szCs w:val="22"/>
+        </w:rPr>
         <w:t xml:space="preserve"> </w:t>
       </w:r>
       <w:r>
@@ -467,127 +667,31 @@
           <w:sz w:val="22"/>
           <w:szCs w:val="22"/>
         </w:rPr>
-        <w:t>die</w:t>
-      </w:r>
-      <w:r>
-        <w:rPr>
-          <w:rFonts w:ascii="Courier New" w:hAnsi="Courier New" w:cs="Courier New"/>
-          <w:sz w:val="22"/>
-          <w:szCs w:val="22"/>
-        </w:rPr>
-        <w:t xml:space="preserve"> tussen de dieren leeft en </w:t>
-      </w:r>
-      <w:r>
-        <w:rPr>
-          <w:rFonts w:ascii="Courier New" w:hAnsi="Courier New" w:cs="Courier New"/>
-          <w:sz w:val="22"/>
-          <w:szCs w:val="22"/>
-        </w:rPr>
-        <w:t xml:space="preserve">daarbij </w:t>
-      </w:r>
-      <w:r>
-        <w:rPr>
-          <w:rFonts w:ascii="Courier New" w:hAnsi="Courier New" w:cs="Courier New"/>
-          <w:sz w:val="22"/>
-          <w:szCs w:val="22"/>
-        </w:rPr>
-        <w:t xml:space="preserve">vaak als een rustige en verstandige gids optreedt. </w:t>
-      </w:r>
-      <w:r>
-        <w:rPr>
-          <w:rFonts w:ascii="Courier New" w:hAnsi="Courier New" w:cs="Courier New"/>
-          <w:sz w:val="22"/>
-          <w:szCs w:val="22"/>
-        </w:rPr>
-        <w:t xml:space="preserve">De verhalen </w:t>
-      </w:r>
-      <w:r>
-        <w:rPr>
-          <w:rFonts w:ascii="Courier New" w:hAnsi="Courier New" w:cs="Courier New"/>
-          <w:sz w:val="22"/>
-          <w:szCs w:val="22"/>
-        </w:rPr>
-        <w:t>zelf zoek</w:t>
-      </w:r>
-      <w:r>
-        <w:rPr>
-          <w:rFonts w:ascii="Courier New" w:hAnsi="Courier New" w:cs="Courier New"/>
-          <w:sz w:val="22"/>
-          <w:szCs w:val="22"/>
-        </w:rPr>
-        <w:t>en</w:t>
-      </w:r>
-      <w:r>
-        <w:rPr>
-          <w:rFonts w:ascii="Courier New" w:hAnsi="Courier New" w:cs="Courier New"/>
-          <w:sz w:val="22"/>
-          <w:szCs w:val="22"/>
-        </w:rPr>
-        <w:t xml:space="preserve"> voortdurend </w:t>
-      </w:r>
-      <w:r>
-        <w:rPr>
-          <w:rFonts w:ascii="Courier New" w:hAnsi="Courier New" w:cs="Courier New"/>
-          <w:sz w:val="22"/>
-          <w:szCs w:val="22"/>
-        </w:rPr>
-        <w:t xml:space="preserve">de grens </w:t>
-      </w:r>
-      <w:r>
-        <w:rPr>
-          <w:rFonts w:ascii="Courier New" w:hAnsi="Courier New" w:cs="Courier New"/>
-          <w:sz w:val="22"/>
-          <w:szCs w:val="22"/>
-        </w:rPr>
-        <w:t xml:space="preserve">op tussen werkelijkheid en fantasie. </w:t>
-      </w:r>
-      <w:r>
-        <w:rPr>
-          <w:rFonts w:ascii="Courier New" w:hAnsi="Courier New" w:cs="Courier New"/>
-          <w:sz w:val="22"/>
-          <w:szCs w:val="22"/>
-        </w:rPr>
-        <w:t>De lezer</w:t>
-      </w:r>
-      <w:r>
-        <w:rPr>
-          <w:rFonts w:ascii="Courier New" w:hAnsi="Courier New" w:cs="Courier New"/>
-          <w:sz w:val="22"/>
-          <w:szCs w:val="22"/>
-        </w:rPr>
-        <w:t xml:space="preserve"> weet dat het om </w:t>
-      </w:r>
-      <w:r>
-        <w:rPr>
-          <w:rFonts w:ascii="Courier New" w:hAnsi="Courier New" w:cs="Courier New"/>
-          <w:sz w:val="22"/>
-          <w:szCs w:val="22"/>
-        </w:rPr>
-        <w:t xml:space="preserve">poppen en </w:t>
-      </w:r>
-      <w:r>
-        <w:rPr>
-          <w:rFonts w:ascii="Courier New" w:hAnsi="Courier New" w:cs="Courier New"/>
-          <w:sz w:val="22"/>
-          <w:szCs w:val="22"/>
-        </w:rPr>
-        <w:t>speelgoed gaat dat tot leven komt in de verbeelding van een kind</w:t>
-      </w:r>
-      <w:r>
-        <w:rPr>
-          <w:rFonts w:ascii="Courier New" w:hAnsi="Courier New" w:cs="Courier New"/>
-          <w:sz w:val="22"/>
-          <w:szCs w:val="22"/>
-        </w:rPr>
-        <w:t>. Binnen de verhalen in het Honderd Bunderbos</w:t>
-      </w:r>
-      <w:r>
-        <w:rPr>
-          <w:rFonts w:ascii="Courier New" w:hAnsi="Courier New" w:cs="Courier New"/>
-          <w:sz w:val="22"/>
-          <w:szCs w:val="22"/>
-        </w:rPr>
-        <w:t xml:space="preserve"> zijn de dieren volwaardige personen met hun eigen karakter, zorgen en verlangens.</w:t>
+        <w:t xml:space="preserve">Wie zijn het </w:t>
+      </w:r>
+      <w:r>
+        <w:rPr>
+          <w:rFonts w:ascii="Courier New" w:hAnsi="Courier New" w:cs="Courier New"/>
+          <w:sz w:val="22"/>
+          <w:szCs w:val="22"/>
+        </w:rPr>
+        <w:t xml:space="preserve">ook al weer </w:t>
+      </w:r>
+      <w:r>
+        <w:rPr>
+          <w:rFonts w:ascii="Courier New" w:hAnsi="Courier New" w:cs="Courier New"/>
+          <w:sz w:val="22"/>
+          <w:szCs w:val="22"/>
+        </w:rPr>
+        <w:t>en waar</w:t>
+      </w:r>
+      <w:r>
+        <w:rPr>
+          <w:rFonts w:ascii="Courier New" w:hAnsi="Courier New" w:cs="Courier New"/>
+          <w:sz w:val="22"/>
+          <w:szCs w:val="22"/>
+        </w:rPr>
+        <w:t xml:space="preserve"> gaat het</w:t>
       </w:r>
       <w:r>
         <w:rPr>
@@ -603,23 +707,15 @@
           <w:sz w:val="22"/>
           <w:szCs w:val="22"/>
         </w:rPr>
-        <w:t>Wie zijn het en waar</w:t>
-      </w:r>
-      <w:r>
-        <w:rPr>
-          <w:rFonts w:ascii="Courier New" w:hAnsi="Courier New" w:cs="Courier New"/>
-          <w:sz w:val="22"/>
-          <w:szCs w:val="22"/>
-        </w:rPr>
-        <w:t xml:space="preserve"> gaat het</w:t>
-      </w:r>
-      <w:r>
-        <w:rPr>
-          <w:rFonts w:ascii="Courier New" w:hAnsi="Courier New" w:cs="Courier New"/>
-          <w:sz w:val="22"/>
-          <w:szCs w:val="22"/>
-        </w:rPr>
-        <w:t xml:space="preserve"> over</w:t>
+        <w:t xml:space="preserve">boek </w:t>
+      </w:r>
+      <w:r>
+        <w:rPr>
+          <w:rFonts w:ascii="Courier New" w:hAnsi="Courier New" w:cs="Courier New"/>
+          <w:sz w:val="22"/>
+          <w:szCs w:val="22"/>
+        </w:rPr>
+        <w:t>over</w:t>
       </w:r>
       <w:r>
         <w:rPr>
@@ -707,15 +803,7 @@
           <w:sz w:val="22"/>
           <w:szCs w:val="22"/>
         </w:rPr>
-        <w:t xml:space="preserve"> bescheidenheid maakt hem </w:t>
-      </w:r>
-      <w:r>
-        <w:rPr>
-          <w:rFonts w:ascii="Courier New" w:hAnsi="Courier New" w:cs="Courier New"/>
-          <w:sz w:val="22"/>
-          <w:szCs w:val="22"/>
-        </w:rPr>
-        <w:t>uitermate</w:t>
+        <w:t xml:space="preserve"> bescheidenheid maakt hem</w:t>
       </w:r>
       <w:r>
         <w:rPr>
@@ -843,7 +931,31 @@
           <w:sz w:val="22"/>
           <w:szCs w:val="22"/>
         </w:rPr>
-        <w:t xml:space="preserve"> geen </w:t>
+        <w:t xml:space="preserve"> </w:t>
+      </w:r>
+      <w:r>
+        <w:rPr>
+          <w:rFonts w:ascii="Courier New" w:hAnsi="Courier New" w:cs="Courier New"/>
+          <w:sz w:val="22"/>
+          <w:szCs w:val="22"/>
+        </w:rPr>
+        <w:t xml:space="preserve">in </w:t>
+      </w:r>
+      <w:r>
+        <w:rPr>
+          <w:rFonts w:ascii="Courier New" w:hAnsi="Courier New" w:cs="Courier New"/>
+          <w:sz w:val="22"/>
+          <w:szCs w:val="22"/>
+        </w:rPr>
+        <w:t xml:space="preserve">geen </w:t>
+      </w:r>
+      <w:r>
+        <w:rPr>
+          <w:rFonts w:ascii="Courier New" w:hAnsi="Courier New" w:cs="Courier New"/>
+          <w:sz w:val="22"/>
+          <w:szCs w:val="22"/>
+        </w:rPr>
+        <w:t xml:space="preserve">enkele situatie </w:t>
       </w:r>
       <w:r>
         <w:rPr>
@@ -923,7 +1035,16 @@
           <w:sz w:val="22"/>
           <w:szCs w:val="22"/>
         </w:rPr>
-        <w:t xml:space="preserve"> af</w:t>
+        <w:t xml:space="preserve"> </w:t>
+      </w:r>
+      <w:r>
+        <w:rPr>
+          <w:rFonts w:ascii="Courier New" w:hAnsi="Courier New" w:cs="Courier New"/>
+          <w:sz w:val="22"/>
+          <w:szCs w:val="22"/>
+        </w:rPr>
+        <w:lastRenderedPageBreak/>
+        <w:t>af</w:t>
       </w:r>
       <w:r>
         <w:rPr>
@@ -939,16 +1060,7 @@
           <w:sz w:val="22"/>
           <w:szCs w:val="22"/>
         </w:rPr>
-        <w:t xml:space="preserve">Hij kent </w:t>
-      </w:r>
-      <w:r>
-        <w:rPr>
-          <w:rFonts w:ascii="Courier New" w:hAnsi="Courier New" w:cs="Courier New"/>
-          <w:sz w:val="22"/>
-          <w:szCs w:val="22"/>
-        </w:rPr>
-        <w:lastRenderedPageBreak/>
-        <w:t>een zwakke kant</w:t>
+        <w:t>Hij kent een zwakke kant</w:t>
       </w:r>
       <w:r>
         <w:rPr>
@@ -1142,7 +1254,23 @@
           <w:sz w:val="22"/>
           <w:szCs w:val="22"/>
         </w:rPr>
-        <w:t xml:space="preserve"> idee uitvoert, maakt het verhaal humoristisch.</w:t>
+        <w:t xml:space="preserve"> idee uitvoert, maakt het verhaal humoristisch</w:t>
+      </w:r>
+      <w:r>
+        <w:rPr>
+          <w:rFonts w:ascii="Courier New" w:hAnsi="Courier New" w:cs="Courier New"/>
+          <w:sz w:val="22"/>
+          <w:szCs w:val="22"/>
+        </w:rPr>
+        <w:t xml:space="preserve"> en vermakelijk</w:t>
+      </w:r>
+      <w:r>
+        <w:rPr>
+          <w:rFonts w:ascii="Courier New" w:hAnsi="Courier New" w:cs="Courier New"/>
+          <w:sz w:val="22"/>
+          <w:szCs w:val="22"/>
+        </w:rPr>
+        <w:t>.</w:t>
       </w:r>
     </w:p>
     <w:p>
@@ -1169,7 +1297,23 @@
           <w:sz w:val="22"/>
           <w:szCs w:val="22"/>
         </w:rPr>
-        <w:t xml:space="preserve"> zijn verhalen over</w:t>
+        <w:t xml:space="preserve"> zijn </w:t>
+      </w:r>
+      <w:r>
+        <w:rPr>
+          <w:rFonts w:ascii="Courier New" w:hAnsi="Courier New" w:cs="Courier New"/>
+          <w:sz w:val="22"/>
+          <w:szCs w:val="22"/>
+        </w:rPr>
+        <w:t xml:space="preserve">allemaal </w:t>
+      </w:r>
+      <w:r>
+        <w:rPr>
+          <w:rFonts w:ascii="Courier New" w:hAnsi="Courier New" w:cs="Courier New"/>
+          <w:sz w:val="22"/>
+          <w:szCs w:val="22"/>
+        </w:rPr>
+        <w:t>verhalen over</w:t>
       </w:r>
       <w:r>
         <w:rPr>
@@ -1277,7 +1421,15 @@
           <w:sz w:val="22"/>
           <w:szCs w:val="22"/>
         </w:rPr>
-        <w:t xml:space="preserve">Gedurende een week </w:t>
+        <w:t>E</w:t>
+      </w:r>
+      <w:r>
+        <w:rPr>
+          <w:rFonts w:ascii="Courier New" w:hAnsi="Courier New" w:cs="Courier New"/>
+          <w:sz w:val="22"/>
+          <w:szCs w:val="22"/>
+        </w:rPr>
+        <w:t xml:space="preserve">en week </w:t>
       </w:r>
       <w:r>
         <w:rPr>
@@ -1293,7 +1445,15 @@
           <w:sz w:val="22"/>
           <w:szCs w:val="22"/>
         </w:rPr>
-        <w:t xml:space="preserve">vormt </w:t>
+        <w:t>zit</w:t>
+      </w:r>
+      <w:r>
+        <w:rPr>
+          <w:rFonts w:ascii="Courier New" w:hAnsi="Courier New" w:cs="Courier New"/>
+          <w:sz w:val="22"/>
+          <w:szCs w:val="22"/>
+        </w:rPr>
+        <w:t xml:space="preserve"> </w:t>
       </w:r>
       <w:r>
         <w:rPr>
@@ -1309,7 +1469,23 @@
           <w:sz w:val="22"/>
           <w:szCs w:val="22"/>
         </w:rPr>
-        <w:t xml:space="preserve"> letterlijk een onderdeel van het huis van Konijn, totdat hij voldoende is afgevallen om weer losgetrokken te worden. De situatie is absurd, maar tegelijkertijd volkomen geloofwaardig binnen de wereld van het Honderd Bunderbos.</w:t>
+        <w:t xml:space="preserve"> letterlijk </w:t>
+      </w:r>
+      <w:r>
+        <w:rPr>
+          <w:rFonts w:ascii="Courier New" w:hAnsi="Courier New" w:cs="Courier New"/>
+          <w:sz w:val="22"/>
+          <w:szCs w:val="22"/>
+        </w:rPr>
+        <w:t>opgesloten in</w:t>
+      </w:r>
+      <w:r>
+        <w:rPr>
+          <w:rFonts w:ascii="Courier New" w:hAnsi="Courier New" w:cs="Courier New"/>
+          <w:sz w:val="22"/>
+          <w:szCs w:val="22"/>
+        </w:rPr>
+        <w:t xml:space="preserve"> het huis van Konijn, totdat hij voldoende is afgevallen om weer losgetrokken te worden. De situatie is absurd, maar tegelijkertijd volkomen geloofwaardig binnen de wereld van het Honderd Bunderbos.</w:t>
       </w:r>
     </w:p>
     <w:p>
@@ -1352,7 +1528,23 @@
           <w:sz w:val="22"/>
           <w:szCs w:val="22"/>
         </w:rPr>
-        <w:t>Poen en Knorretje</w:t>
+        <w:t>Poe</w:t>
+      </w:r>
+      <w:r>
+        <w:rPr>
+          <w:rFonts w:ascii="Courier New" w:hAnsi="Courier New" w:cs="Courier New"/>
+          <w:sz w:val="22"/>
+          <w:szCs w:val="22"/>
+        </w:rPr>
+        <w:t>h</w:t>
+      </w:r>
+      <w:r>
+        <w:rPr>
+          <w:rFonts w:ascii="Courier New" w:hAnsi="Courier New" w:cs="Courier New"/>
+          <w:sz w:val="22"/>
+          <w:szCs w:val="22"/>
+        </w:rPr>
+        <w:t xml:space="preserve"> en Knorretje</w:t>
       </w:r>
       <w:r>
         <w:rPr>
@@ -1376,7 +1568,32 @@
           <w:sz w:val="22"/>
           <w:szCs w:val="22"/>
         </w:rPr>
-        <w:t xml:space="preserve">in verwarring of ontdekking. Wanneer zij bijvoorbeeld sporen in de sneeuw volgen, raken zij ervan overtuigd dat zij een gevaarlijk wezen op het spoor zijn. Pas later beseffen zij dat zij al die tijd hun eigen voetstappen hebben gevolgd. Het verhaal laat niet alleen zien hoe gemakkelijk verbeelding </w:t>
+        <w:t xml:space="preserve">in verwarring of ontdekking. Wanneer </w:t>
+      </w:r>
+      <w:r>
+        <w:rPr>
+          <w:rFonts w:ascii="Courier New" w:hAnsi="Courier New" w:cs="Courier New"/>
+          <w:sz w:val="22"/>
+          <w:szCs w:val="22"/>
+        </w:rPr>
+        <w:t xml:space="preserve">Poeh en Knorretje </w:t>
+      </w:r>
+      <w:r>
+        <w:rPr>
+          <w:rFonts w:ascii="Courier New" w:hAnsi="Courier New" w:cs="Courier New"/>
+          <w:sz w:val="22"/>
+          <w:szCs w:val="22"/>
+        </w:rPr>
+        <w:t xml:space="preserve">bijvoorbeeld sporen in de sneeuw volgen, raken zij ervan overtuigd dat zij een gevaarlijk wezen op het spoor zijn. Pas later beseffen zij dat zij al die tijd hun eigen voetstappen hebben gevolgd. Het verhaal laat niet alleen </w:t>
+      </w:r>
+      <w:r>
+        <w:rPr>
+          <w:rFonts w:ascii="Courier New" w:hAnsi="Courier New" w:cs="Courier New"/>
+          <w:sz w:val="22"/>
+          <w:szCs w:val="22"/>
+        </w:rPr>
+        <w:lastRenderedPageBreak/>
+        <w:t xml:space="preserve">zien hoe gemakkelijk verbeelding </w:t>
       </w:r>
       <w:r>
         <w:rPr>
@@ -1408,7 +1625,15 @@
           <w:sz w:val="22"/>
           <w:szCs w:val="22"/>
         </w:rPr>
-        <w:t>, maar ook hoe vriendschap angst draaglijk maakt.</w:t>
+        <w:t xml:space="preserve"> en</w:t>
+      </w:r>
+      <w:r>
+        <w:rPr>
+          <w:rFonts w:ascii="Courier New" w:hAnsi="Courier New" w:cs="Courier New"/>
+          <w:sz w:val="22"/>
+          <w:szCs w:val="22"/>
+        </w:rPr>
+        <w:t xml:space="preserve"> ook hoe vriendschap angst draaglijk maakt.</w:t>
       </w:r>
     </w:p>
     <w:p>
@@ -1427,7 +1652,6 @@
           <w:sz w:val="22"/>
           <w:szCs w:val="22"/>
         </w:rPr>
-        <w:lastRenderedPageBreak/>
         <w:t xml:space="preserve">Een </w:t>
       </w:r>
       <w:r>
@@ -1460,7 +1684,47 @@
           <w:sz w:val="22"/>
           <w:szCs w:val="22"/>
         </w:rPr>
-        <w:t xml:space="preserve"> is Iejoor, de sombere ezel. Hij verwacht altijd het ergste en ziet in elke gebeurtenis een reden tot pessimisme. Toch wordt hij door niemand afgewezen. Zijn vrienden accepteren hem zoals hij is. Dat blijkt uit het verhaal over zijn verjaardag. Poeh wil hem een pot honing geven, maar eet onderweg de inhoud op. Knorretje heeft een mooie ballon gekocht, maar laat die per ongeluk knappen. Uiteindelijk krijgt Iejoor een lege honingpot en een kapotte ballon. </w:t>
+        <w:t xml:space="preserve"> is Iejoor, de sombere ezel. Hij verwacht altijd het ergste en ziet in elke gebeurtenis een reden tot pessimisme. Toch wordt hij door niemand afgewezen. Zijn vrienden accepteren hem zoals hij is. Dat blijkt uit het verhaal over zijn verjaardag. Poeh wil hem een pot honing geven, maar eet onderweg de inhoud op. Knorretje heeft een mooie ballon gekocht, maar laat die per ongeluk knappen. Uiteindelijk krijgt Iejoor een lege honingpot</w:t>
+      </w:r>
+      <w:r>
+        <w:rPr>
+          <w:rFonts w:ascii="Courier New" w:hAnsi="Courier New" w:cs="Courier New"/>
+          <w:sz w:val="22"/>
+          <w:szCs w:val="22"/>
+        </w:rPr>
+        <w:t xml:space="preserve"> van Poeh</w:t>
+      </w:r>
+      <w:r>
+        <w:rPr>
+          <w:rFonts w:ascii="Courier New" w:hAnsi="Courier New" w:cs="Courier New"/>
+          <w:sz w:val="22"/>
+          <w:szCs w:val="22"/>
+        </w:rPr>
+        <w:t xml:space="preserve"> en een kapotte ballon</w:t>
+      </w:r>
+      <w:r>
+        <w:rPr>
+          <w:rFonts w:ascii="Courier New" w:hAnsi="Courier New" w:cs="Courier New"/>
+          <w:sz w:val="22"/>
+          <w:szCs w:val="22"/>
+        </w:rPr>
+        <w:t xml:space="preserve"> van Kno</w:t>
+      </w:r>
+      <w:r>
+        <w:rPr>
+          <w:rFonts w:ascii="Courier New" w:hAnsi="Courier New" w:cs="Courier New"/>
+          <w:sz w:val="22"/>
+          <w:szCs w:val="22"/>
+        </w:rPr>
+        <w:t>retje</w:t>
+      </w:r>
+      <w:r>
+        <w:rPr>
+          <w:rFonts w:ascii="Courier New" w:hAnsi="Courier New" w:cs="Courier New"/>
+          <w:sz w:val="22"/>
+          <w:szCs w:val="22"/>
+        </w:rPr>
+        <w:t xml:space="preserve">. </w:t>
       </w:r>
       <w:r>
         <w:rPr>
@@ -1476,7 +1740,15 @@
           <w:sz w:val="22"/>
           <w:szCs w:val="22"/>
         </w:rPr>
-        <w:t xml:space="preserve">hij </w:t>
+        <w:t>Iejoor</w:t>
+      </w:r>
+      <w:r>
+        <w:rPr>
+          <w:rFonts w:ascii="Courier New" w:hAnsi="Courier New" w:cs="Courier New"/>
+          <w:sz w:val="22"/>
+          <w:szCs w:val="22"/>
+        </w:rPr>
+        <w:t xml:space="preserve"> </w:t>
       </w:r>
       <w:r>
         <w:rPr>
@@ -1528,23 +1800,15 @@
           <w:sz w:val="22"/>
           <w:szCs w:val="22"/>
         </w:rPr>
-        <w:t xml:space="preserve"> en daarmee </w:t>
-      </w:r>
-      <w:r>
-        <w:rPr>
-          <w:rFonts w:ascii="Courier New" w:hAnsi="Courier New" w:cs="Courier New"/>
-          <w:sz w:val="22"/>
-          <w:szCs w:val="22"/>
-        </w:rPr>
-        <w:t xml:space="preserve">combineert </w:t>
-      </w:r>
-      <w:r>
-        <w:rPr>
-          <w:rFonts w:ascii="Courier New" w:hAnsi="Courier New" w:cs="Courier New"/>
-          <w:sz w:val="22"/>
-          <w:szCs w:val="22"/>
-        </w:rPr>
-        <w:t xml:space="preserve">het verhaal </w:t>
+        <w:t xml:space="preserve"> en het verhaal </w:t>
+      </w:r>
+      <w:r>
+        <w:rPr>
+          <w:rFonts w:ascii="Courier New" w:hAnsi="Courier New" w:cs="Courier New"/>
+          <w:sz w:val="22"/>
+          <w:szCs w:val="22"/>
+        </w:rPr>
+        <w:t xml:space="preserve">combineert hiermee </w:t>
       </w:r>
       <w:r>
         <w:rPr>
@@ -1553,6 +1817,14 @@
           <w:szCs w:val="22"/>
         </w:rPr>
         <w:t>humor met een ontroerende boodschap</w:t>
+      </w:r>
+      <w:r>
+        <w:rPr>
+          <w:rFonts w:ascii="Courier New" w:hAnsi="Courier New" w:cs="Courier New"/>
+          <w:sz w:val="22"/>
+          <w:szCs w:val="22"/>
+        </w:rPr>
+        <w:t>,</w:t>
       </w:r>
       <w:r>
         <w:rPr>
@@ -1718,7 +1990,7 @@
           <w:sz w:val="22"/>
           <w:szCs w:val="22"/>
         </w:rPr>
-        <w:t xml:space="preserve">Een van de belangrijkste thema’s van het boek is vriendschap. De bewoners van het Honderd Bunderbos zijn sterk van elkaar afhankelijk. Wanneer iemand hulp nodig heeft, staan de anderen klaar. Tijdens een overstroming gebruikt Poeh zijn inventiviteit om Knorretje te redden. Wanneer Iejoor zijn staart verliest, zetten zijn vrienden alles op alles om die terug te vinden. </w:t>
+        <w:t xml:space="preserve">Een van de belangrijkste thema’s van het boek is vriendschap. De bewoners van het Honderd Bunderbos zijn van elkaar afhankelijk. Wanneer iemand hulp nodig heeft, staan de anderen klaar. Tijdens een overstroming gebruikt Poeh zijn inventiviteit om Knorretje te redden. Wanneer Iejoor zijn staart verliest, zetten zijn vrienden alles op alles om die terug te vinden. </w:t>
       </w:r>
       <w:r>
         <w:rPr>
@@ -1814,7 +2086,23 @@
           <w:sz w:val="22"/>
           <w:szCs w:val="22"/>
         </w:rPr>
-        <w:t xml:space="preserve"> elkaar accepteren en ondersteunen.</w:t>
+        <w:t xml:space="preserve"> elkaar accepteren en ondersteunen</w:t>
+      </w:r>
+      <w:r>
+        <w:rPr>
+          <w:rFonts w:ascii="Courier New" w:hAnsi="Courier New" w:cs="Courier New"/>
+          <w:sz w:val="22"/>
+          <w:szCs w:val="22"/>
+        </w:rPr>
+        <w:t xml:space="preserve"> en de verschillen het geheel sterker maken</w:t>
+      </w:r>
+      <w:r>
+        <w:rPr>
+          <w:rFonts w:ascii="Courier New" w:hAnsi="Courier New" w:cs="Courier New"/>
+          <w:sz w:val="22"/>
+          <w:szCs w:val="22"/>
+        </w:rPr>
+        <w:t>.</w:t>
       </w:r>
       <w:r>
         <w:rPr>
@@ -1830,7 +2118,16 @@
           <w:sz w:val="22"/>
           <w:szCs w:val="22"/>
         </w:rPr>
-        <w:t xml:space="preserve">thema is verbeelding. Het hele boek is doordrenkt van de fantasie van een kind. Expedities, monsters en grote ontdekkingen blijken vaak gewone gebeurtenissen te zijn die door de ogen van kinderen een bijzondere betekenis krijgen. Zo ondernemen Christopher Robin en zijn vrienden een </w:t>
+        <w:t xml:space="preserve">thema is verbeelding. Het hele boek is doordrenkt van de fantasie van een </w:t>
+      </w:r>
+      <w:r>
+        <w:rPr>
+          <w:rFonts w:ascii="Courier New" w:hAnsi="Courier New" w:cs="Courier New"/>
+          <w:sz w:val="22"/>
+          <w:szCs w:val="22"/>
+        </w:rPr>
+        <w:lastRenderedPageBreak/>
+        <w:t xml:space="preserve">kind. Expedities, monsters en grote ontdekkingen blijken vaak gewone gebeurtenissen te zijn die door de ogen van kinderen een bijzondere betekenis krijgen. Zo ondernemen Christopher Robin en zijn vrienden een </w:t>
       </w:r>
       <w:r>
         <w:rPr>
@@ -1862,16 +2159,7 @@
           <w:sz w:val="22"/>
           <w:szCs w:val="22"/>
         </w:rPr>
-        <w:t xml:space="preserve"> om de </w:t>
-      </w:r>
-      <w:r>
-        <w:rPr>
-          <w:rFonts w:ascii="Courier New" w:hAnsi="Courier New" w:cs="Courier New"/>
-          <w:sz w:val="22"/>
-          <w:szCs w:val="22"/>
-        </w:rPr>
-        <w:lastRenderedPageBreak/>
-        <w:t>Noordpool te ontdekken, terwijl zij in werkelijkheid slechts een wandeling maken. Toch voelt de onderneming voor hen als een groot avontuur. Milne laat zien dat de verbeelding geen vlucht uit de werkelijkheid is, maar een manier om de wereld rijker en betekenisvoller te maken.</w:t>
+        <w:t xml:space="preserve"> om de Noordpool te ontdekken, terwijl zij in werkelijkheid slechts een wandeling maken. Toch voelt de onderneming voor hen als een groot avontuur. Milne laat zien dat de verbeelding geen vlucht uit de werkelijkheid is, maar een manier om de wereld rijker en betekenisvoller te maken.</w:t>
       </w:r>
       <w:r>
         <w:rPr>
@@ -2001,7 +2289,15 @@
           <w:sz w:val="22"/>
           <w:szCs w:val="22"/>
         </w:rPr>
-        <w:t>en jou</w:t>
+        <w:t xml:space="preserve">en </w:t>
+      </w:r>
+      <w:r>
+        <w:rPr>
+          <w:rFonts w:ascii="Courier New" w:hAnsi="Courier New" w:cs="Courier New"/>
+          <w:sz w:val="22"/>
+          <w:szCs w:val="22"/>
+        </w:rPr>
+        <w:t>de lezer</w:t>
       </w:r>
       <w:r>
         <w:rPr>
@@ -2041,7 +2337,15 @@
           <w:sz w:val="22"/>
           <w:szCs w:val="22"/>
         </w:rPr>
-        <w:t>Bijna een eeuw na zijn verschijnen blijft </w:t>
+        <w:t>E</w:t>
+      </w:r>
+      <w:r>
+        <w:rPr>
+          <w:rFonts w:ascii="Courier New" w:hAnsi="Courier New" w:cs="Courier New"/>
+          <w:sz w:val="22"/>
+          <w:szCs w:val="22"/>
+        </w:rPr>
+        <w:t>en eeuw na zijn verschijnen blijft </w:t>
       </w:r>
       <w:r>
         <w:rPr>
@@ -2059,7 +2363,39 @@
           <w:sz w:val="22"/>
           <w:szCs w:val="22"/>
         </w:rPr>
-        <w:t> daarom meer dan een kinderboek. Het is een ode aan vriendschap, verbeelding en menselijke verbondenheid. Achter de humor en de speelse avonturen schuilt een wijsheid die zowel kinderen als volwassenen aanspreekt. In de rustige wereld van het Honderd Bunderbos vinden lezers een herinnering aan wat werkelijk van waarde is: aandacht voor elkaar, ruimte voor verschillen en het vermogen om met verwondering naar de wereld te blijven kijken.</w:t>
+        <w:t xml:space="preserve"> daarom meer dan een kinderboek. Het is een ode aan vriendschap, verbeelding en menselijke verbondenheid. </w:t>
+      </w:r>
+      <w:r>
+        <w:rPr>
+          <w:rFonts w:ascii="Courier New" w:hAnsi="Courier New" w:cs="Courier New"/>
+          <w:sz w:val="22"/>
+          <w:szCs w:val="22"/>
+        </w:rPr>
+        <w:t xml:space="preserve">Het is een ode aan de Grote Gemeenschap. </w:t>
+      </w:r>
+      <w:r>
+        <w:rPr>
+          <w:rFonts w:ascii="Courier New" w:hAnsi="Courier New" w:cs="Courier New"/>
+          <w:sz w:val="22"/>
+          <w:szCs w:val="22"/>
+        </w:rPr>
+        <w:t xml:space="preserve">Achter de humor en de speelse avonturen schuilt een wijsheid die zowel kinderen als volwassenen aanspreekt. In de rustige wereld van het Honderd Bunderbos vinden lezers een herinnering aan wat werkelijk van waarde is: aandacht voor elkaar, ruimte voor verschillen en het vermogen om met verwondering naar </w:t>
+      </w:r>
+      <w:r>
+        <w:rPr>
+          <w:rFonts w:ascii="Courier New" w:hAnsi="Courier New" w:cs="Courier New"/>
+          <w:sz w:val="22"/>
+          <w:szCs w:val="22"/>
+        </w:rPr>
+        <w:t xml:space="preserve">elkaar en </w:t>
+      </w:r>
+      <w:r>
+        <w:rPr>
+          <w:rFonts w:ascii="Courier New" w:hAnsi="Courier New" w:cs="Courier New"/>
+          <w:sz w:val="22"/>
+          <w:szCs w:val="22"/>
+        </w:rPr>
+        <w:t>de wereld te blijven kijken.</w:t>
       </w:r>
       <w:r>
         <w:rPr>
@@ -2075,7 +2411,65 @@
           <w:sz w:val="22"/>
           <w:szCs w:val="22"/>
         </w:rPr>
-        <w:t>In Winnie-the-Pooh draait alles om vriendschap, kleine zorgen</w:t>
+        <w:t>In </w:t>
+      </w:r>
+      <w:r>
+        <w:rPr>
+          <w:rFonts w:ascii="Courier New" w:hAnsi="Courier New" w:cs="Courier New"/>
+          <w:i/>
+          <w:iCs/>
+          <w:sz w:val="22"/>
+          <w:szCs w:val="22"/>
+        </w:rPr>
+        <w:t>Winnie-</w:t>
+      </w:r>
+      <w:r>
+        <w:rPr>
+          <w:rFonts w:ascii="Courier New" w:hAnsi="Courier New" w:cs="Courier New"/>
+          <w:i/>
+          <w:iCs/>
+          <w:sz w:val="22"/>
+          <w:szCs w:val="22"/>
+        </w:rPr>
+        <w:t>the</w:t>
+      </w:r>
+      <w:r>
+        <w:rPr>
+          <w:rFonts w:ascii="Courier New" w:hAnsi="Courier New" w:cs="Courier New"/>
+          <w:i/>
+          <w:iCs/>
+          <w:sz w:val="22"/>
+          <w:szCs w:val="22"/>
+        </w:rPr>
+        <w:t>-Po</w:t>
+      </w:r>
+      <w:r>
+        <w:rPr>
+          <w:rFonts w:ascii="Courier New" w:hAnsi="Courier New" w:cs="Courier New"/>
+          <w:i/>
+          <w:iCs/>
+          <w:sz w:val="22"/>
+          <w:szCs w:val="22"/>
+        </w:rPr>
+        <w:t>e</w:t>
+      </w:r>
+      <w:r>
+        <w:rPr>
+          <w:rFonts w:ascii="Courier New" w:hAnsi="Courier New" w:cs="Courier New"/>
+          <w:i/>
+          <w:iCs/>
+          <w:sz w:val="22"/>
+          <w:szCs w:val="22"/>
+        </w:rPr>
+        <w:t>h</w:t>
+      </w:r>
+      <w:r>
+        <w:rPr>
+          <w:rFonts w:ascii="Courier New" w:hAnsi="Courier New" w:cs="Courier New"/>
+          <w:sz w:val="22"/>
+          <w:szCs w:val="22"/>
+        </w:rPr>
+        <w:t> draait alles om vriendschap, kleine zorgen</w:t>
       </w:r>
       <w:r>
         <w:rPr>
@@ -2112,7 +2506,56 @@
           <w:sz w:val="22"/>
           <w:szCs w:val="22"/>
         </w:rPr>
-        <w:t xml:space="preserve">Die tijdloze wereld van deze Grote Gemeenschap is heel anders dan de Echte Mannenwereld van tegenwoordig met onze roodharige hoofdpersoon. Vriendschap, verbeelding en verbondenheid hebben </w:t>
+        <w:lastRenderedPageBreak/>
+        <w:t xml:space="preserve">Die tijdloze wereld van deze Grote Gemeenschap is heel anders dan de </w:t>
+      </w:r>
+      <w:r>
+        <w:rPr>
+          <w:rFonts w:ascii="Courier New" w:hAnsi="Courier New" w:cs="Courier New"/>
+          <w:sz w:val="22"/>
+          <w:szCs w:val="22"/>
+        </w:rPr>
+        <w:t>Grote Samenleving</w:t>
+      </w:r>
+      <w:r>
+        <w:rPr>
+          <w:rFonts w:ascii="Courier New" w:hAnsi="Courier New" w:cs="Courier New"/>
+          <w:sz w:val="22"/>
+          <w:szCs w:val="22"/>
+        </w:rPr>
+        <w:t xml:space="preserve"> van tegenwoordig met onze roodharige </w:t>
+      </w:r>
+      <w:r>
+        <w:rPr>
+          <w:rFonts w:ascii="Courier New" w:hAnsi="Courier New" w:cs="Courier New"/>
+          <w:sz w:val="22"/>
+          <w:szCs w:val="22"/>
+        </w:rPr>
+        <w:t xml:space="preserve">zelfbenoemde </w:t>
+      </w:r>
+      <w:r>
+        <w:rPr>
+          <w:rFonts w:ascii="Courier New" w:hAnsi="Courier New" w:cs="Courier New"/>
+          <w:sz w:val="22"/>
+          <w:szCs w:val="22"/>
+        </w:rPr>
+        <w:t>hoofdpersoon</w:t>
+      </w:r>
+      <w:r>
+        <w:rPr>
+          <w:rFonts w:ascii="Courier New" w:hAnsi="Courier New" w:cs="Courier New"/>
+          <w:sz w:val="22"/>
+          <w:szCs w:val="22"/>
+        </w:rPr>
+        <w:t>, die niet alleen het leven in zijn eigen bos onaangenaam maakt maar ook het leven in andere bossen</w:t>
+      </w:r>
+      <w:r>
+        <w:rPr>
+          <w:rFonts w:ascii="Courier New" w:hAnsi="Courier New" w:cs="Courier New"/>
+          <w:sz w:val="22"/>
+          <w:szCs w:val="22"/>
+        </w:rPr>
+        <w:t xml:space="preserve">. Vriendschap, verbeelding en verbondenheid hebben </w:t>
       </w:r>
       <w:r>
         <w:rPr>
@@ -2128,7 +2571,6 @@
           <w:sz w:val="22"/>
           <w:szCs w:val="22"/>
         </w:rPr>
-        <w:lastRenderedPageBreak/>
         <w:t xml:space="preserve">plaatsgemaakt voor haat, rancune en angst.  </w:t>
       </w:r>
       <w:r>
@@ -2211,7 +2653,39 @@
           <w:sz w:val="22"/>
           <w:szCs w:val="22"/>
         </w:rPr>
-        <w:t>Dat klonk heel anders dan de roodharige hoofdpersoon die op 27 maart over Iran zei:</w:t>
+        <w:t>Dat kl</w:t>
+      </w:r>
+      <w:r>
+        <w:rPr>
+          <w:rFonts w:ascii="Courier New" w:hAnsi="Courier New" w:cs="Courier New"/>
+          <w:sz w:val="22"/>
+          <w:szCs w:val="22"/>
+        </w:rPr>
+        <w:t>in</w:t>
+      </w:r>
+      <w:r>
+        <w:rPr>
+          <w:rFonts w:ascii="Courier New" w:hAnsi="Courier New" w:cs="Courier New"/>
+          <w:sz w:val="22"/>
+          <w:szCs w:val="22"/>
+        </w:rPr>
+        <w:t>k</w:t>
+      </w:r>
+      <w:r>
+        <w:rPr>
+          <w:rFonts w:ascii="Courier New" w:hAnsi="Courier New" w:cs="Courier New"/>
+          <w:sz w:val="22"/>
+          <w:szCs w:val="22"/>
+        </w:rPr>
+        <w:t>t tocn wel</w:t>
+      </w:r>
+      <w:r>
+        <w:rPr>
+          <w:rFonts w:ascii="Courier New" w:hAnsi="Courier New" w:cs="Courier New"/>
+          <w:sz w:val="22"/>
+          <w:szCs w:val="22"/>
+        </w:rPr>
+        <w:t xml:space="preserve"> heel anders dan de roodharige hoofdpersoon die op 27 maart over Iran zei:</w:t>
       </w:r>
       <w:r>
         <w:rPr>

</xml_diff>